<commit_message>
ONS Regional GVA breakdown into CSVs
</commit_message>
<xml_diff>
--- a/docs/quarto_docs/SectorGrowthInvestment_July2024.docx
+++ b/docs/quarto_docs/SectorGrowthInvestment_July2024.docx
@@ -125,263 +125,263 @@
     </w:p>
     <w:p>
       <w:pPr>
+        <w:pStyle w:val="Compact"/>
         <w:numPr>
           <w:ilvl w:val="0"/>
           <w:numId w:val="1001"/>
         </w:numPr>
+      </w:pPr>
+      <w:r>
+        <w:t xml:space="preserve">In the UK, direct low carbon and renewable energy jobs are around 1.3% of the total, according to ONS’ LCREE survey. LCREE job growth has accelerated to 6% a year during and since COVID. The largest green sectors by proportion are power/energy, construction, manufacturing, water, and scientific/technical, though in South Yorkshire, construction, manufacturing and scientific make up the bulk of green jobs. The power sector appears highly productive but has relatively very small job numbers.</w:t>
+      </w:r>
+    </w:p>
+    <w:p>
+      <w:pPr>
         <w:pStyle w:val="Compact"/>
-      </w:pPr>
-      <w:r>
-        <w:t xml:space="preserve">In the UK, direct low carbon and renewable energy jobs are around 1.3% of the total, according to ONS’ LCREE survey. LCREE job growth has accelerated to 6% a year during and since COVID. The largest green sectors by proportion are power/energy, construction, manufacturing, water, and scientific/technical, though in South Yorkshire, construction, manufacturing and scientific make up the bulk of green jobs. The power sector appears highly productive but has relatively very small job numbers.</w:t>
-      </w:r>
-    </w:p>
-    <w:p>
-      <w:pPr>
         <w:numPr>
           <w:ilvl w:val="0"/>
           <w:numId w:val="1001"/>
         </w:numPr>
+      </w:pPr>
+      <w:r>
+        <w:t xml:space="preserve">The context of South Yorkshire’s economy is that, for sectors where green jobs growth is concentrated, manufacturing is on average at bottom end of UK productivity, with construction much higher. Scientific/technical is also at the lower end, though recently is improving.</w:t>
+      </w:r>
+    </w:p>
+    <w:p>
+      <w:pPr>
         <w:pStyle w:val="Compact"/>
-      </w:pPr>
-      <w:r>
-        <w:t xml:space="preserve">The context of South Yorkshire’s economy is that, for sectors where green jobs growth is concentrated, manufacturing is on average at bottom end of UK productivity, with construction much higher. Scientific/technical is also at the lower end, though recently is improving.</w:t>
-      </w:r>
-    </w:p>
-    <w:p>
-      <w:pPr>
         <w:numPr>
           <w:ilvl w:val="1"/>
           <w:numId w:val="1002"/>
         </w:numPr>
+      </w:pPr>
+      <w:r>
+        <w:t xml:space="preserve">SY’s more productive sectors like ICT and education are not LCREE-strong. But if thinking about sector connectivity/linkages, they can both play key roles in green jobs growth (including education’s role in SY’s training/upskilling needs, which would boost that sector’s output).</w:t>
+      </w:r>
+    </w:p>
+    <w:p>
+      <w:pPr>
         <w:pStyle w:val="Compact"/>
-      </w:pPr>
-      <w:r>
-        <w:t xml:space="preserve">SY’s more productive sectors like ICT and education are not LCREE-strong. But if thinking about sector connectivity/linkages, they can both play key roles in green jobs growth (including education’s role in SY’s training/upskilling needs, which would boost that sector’s output).</w:t>
-      </w:r>
-    </w:p>
-    <w:p>
-      <w:pPr>
         <w:numPr>
           <w:ilvl w:val="0"/>
           <w:numId w:val="1001"/>
         </w:numPr>
+      </w:pPr>
+      <w:r>
+        <w:t xml:space="preserve">Scenarios for</w:t>
+      </w:r>
+      <w:r>
+        <w:t xml:space="preserve"> </w:t>
+      </w:r>
+      <w:r>
+        <w:t xml:space="preserve">‘</w:t>
+      </w:r>
+      <w:r>
+        <w:t xml:space="preserve">adding a new job to South Yorkshire</w:t>
+      </w:r>
+      <w:r>
+        <w:t xml:space="preserve">’</w:t>
+      </w:r>
+      <w:r>
+        <w:t xml:space="preserve"> </w:t>
+      </w:r>
+      <w:r>
+        <w:t xml:space="preserve">are modelled to show their average GVA addition, explore the impact on sectors, geographical push/pull and other measures, and what macro factors will shape outcomes, including compositional changes and over/under supply of skills.</w:t>
+      </w:r>
+    </w:p>
+    <w:p>
+      <w:pPr>
         <w:pStyle w:val="Compact"/>
-      </w:pPr>
-      <w:r>
-        <w:t xml:space="preserve">Scenarios for</w:t>
-      </w:r>
-      <w:r>
-        <w:t xml:space="preserve"> </w:t>
-      </w:r>
-      <w:r>
-        <w:t xml:space="preserve">‘</w:t>
-      </w:r>
-      <w:r>
-        <w:t xml:space="preserve">adding a new job to South Yorkshire</w:t>
-      </w:r>
-      <w:r>
-        <w:t xml:space="preserve">’</w:t>
-      </w:r>
-      <w:r>
-        <w:t xml:space="preserve"> </w:t>
-      </w:r>
-      <w:r>
-        <w:t xml:space="preserve">are modelled to show their average GVA addition, explore the impact on sectors, geographical push/pull and other measures, and what macro factors will shape outcomes, including compositional changes and over/under supply of skills.</w:t>
-      </w:r>
-    </w:p>
-    <w:p>
-      <w:pPr>
         <w:numPr>
           <w:ilvl w:val="1"/>
           <w:numId w:val="1003"/>
         </w:numPr>
+      </w:pPr>
+      <w:r>
+        <w:t xml:space="preserve">Average GVA numbers are given for broad sectors, with percent gains if job exchanges occur within South Yorkshire. More productive sectors of course have higher additions from job investment.</w:t>
+      </w:r>
+    </w:p>
+    <w:p>
+      <w:pPr>
         <w:pStyle w:val="Compact"/>
-      </w:pPr>
-      <w:r>
-        <w:t xml:space="preserve">Average GVA numbers are given for broad sectors, with percent gains if job exchanges occur within South Yorkshire. More productive sectors of course have higher additions from job investment.</w:t>
-      </w:r>
-    </w:p>
-    <w:p>
-      <w:pPr>
         <w:numPr>
           <w:ilvl w:val="1"/>
           <w:numId w:val="1003"/>
         </w:numPr>
+      </w:pPr>
+      <w:r>
+        <w:t xml:space="preserve">This section makes the point that productivity accounting favours filling new jobs with commuters, migrants (internal or external to UK) and newly qualified workers because those are not net of any other SY workers moving position. A later section expands on this: being clear on how to measure GVA</w:t>
+      </w:r>
+      <w:r>
+        <w:t xml:space="preserve"> </w:t>
+      </w:r>
+      <w:r>
+        <w:t xml:space="preserve">‘</w:t>
+      </w:r>
+      <w:r>
+        <w:t xml:space="preserve">success</w:t>
+      </w:r>
+      <w:r>
+        <w:t xml:space="preserve">’</w:t>
+      </w:r>
+      <w:r>
+        <w:t xml:space="preserve"> </w:t>
+      </w:r>
+      <w:r>
+        <w:t xml:space="preserve">is vital, and for regional policy may not overlap with national level measures.</w:t>
+      </w:r>
+    </w:p>
+    <w:p>
+      <w:pPr>
         <w:pStyle w:val="Compact"/>
-      </w:pPr>
-      <w:r>
-        <w:t xml:space="preserve">This section makes the point that productivity accounting favours filling new jobs with commuters, migrants (internal or external to UK) and newly qualified workers because those are not net of any other SY workers moving position. A later section expands on this: being clear on how to measure GVA</w:t>
-      </w:r>
-      <w:r>
-        <w:t xml:space="preserve"> </w:t>
-      </w:r>
-      <w:r>
-        <w:t xml:space="preserve">‘</w:t>
-      </w:r>
-      <w:r>
-        <w:t xml:space="preserve">success</w:t>
-      </w:r>
-      <w:r>
-        <w:t xml:space="preserve">’</w:t>
-      </w:r>
-      <w:r>
-        <w:t xml:space="preserve"> </w:t>
-      </w:r>
-      <w:r>
-        <w:t xml:space="preserve">is vital, and for regional policy may not overlap with national level measures.</w:t>
-      </w:r>
-    </w:p>
-    <w:p>
-      <w:pPr>
         <w:numPr>
           <w:ilvl w:val="0"/>
           <w:numId w:val="1001"/>
         </w:numPr>
+      </w:pPr>
+      <w:r>
+        <w:t xml:space="preserve">Investment choices, including capital investment, may not boost jobs. Data is presented to show the range of historical GVA vs job outcomes for an example sector (manufacturing). This highlights a need to be explicit about what kind of</w:t>
+      </w:r>
+      <w:r>
+        <w:t xml:space="preserve"> </w:t>
+      </w:r>
+      <w:r>
+        <w:t xml:space="preserve">‘</w:t>
+      </w:r>
+      <w:r>
+        <w:t xml:space="preserve">good growth</w:t>
+      </w:r>
+      <w:r>
+        <w:t xml:space="preserve">’</w:t>
+      </w:r>
+      <w:r>
+        <w:t xml:space="preserve"> </w:t>
+      </w:r>
+      <w:r>
+        <w:t xml:space="preserve">policy to aim for.</w:t>
+      </w:r>
+    </w:p>
+    <w:p>
+      <w:pPr>
         <w:pStyle w:val="Compact"/>
-      </w:pPr>
-      <w:r>
-        <w:t xml:space="preserve">Investment choices, including capital investment, may not boost jobs. Data is presented to show the range of historical GVA vs job outcomes for an example sector (manufacturing). This highlights a need to be explicit about what kind of</w:t>
-      </w:r>
-      <w:r>
-        <w:t xml:space="preserve"> </w:t>
-      </w:r>
-      <w:r>
-        <w:t xml:space="preserve">‘</w:t>
-      </w:r>
-      <w:r>
-        <w:t xml:space="preserve">good growth</w:t>
-      </w:r>
-      <w:r>
-        <w:t xml:space="preserve">’</w:t>
-      </w:r>
-      <w:r>
-        <w:t xml:space="preserve"> </w:t>
-      </w:r>
-      <w:r>
-        <w:t xml:space="preserve">policy to aim for.</w:t>
-      </w:r>
-    </w:p>
-    <w:p>
-      <w:pPr>
         <w:numPr>
           <w:ilvl w:val="0"/>
           <w:numId w:val="1001"/>
         </w:numPr>
+      </w:pPr>
+      <w:r>
+        <w:t xml:space="preserve">Five policy</w:t>
+      </w:r>
+      <w:r>
+        <w:t xml:space="preserve"> </w:t>
+      </w:r>
+      <w:r>
+        <w:t xml:space="preserve">‘</w:t>
+      </w:r>
+      <w:r>
+        <w:t xml:space="preserve">dials</w:t>
+      </w:r>
+      <w:r>
+        <w:t xml:space="preserve">’</w:t>
+      </w:r>
+      <w:r>
+        <w:t xml:space="preserve"> </w:t>
+      </w:r>
+      <w:r>
+        <w:t xml:space="preserve">are described (some more in direct control than others) for job investment:</w:t>
+      </w:r>
+    </w:p>
+    <w:p>
+      <w:pPr>
         <w:pStyle w:val="Compact"/>
-      </w:pPr>
-      <w:r>
-        <w:t xml:space="preserve">Five policy</w:t>
-      </w:r>
-      <w:r>
-        <w:t xml:space="preserve"> </w:t>
-      </w:r>
-      <w:r>
-        <w:t xml:space="preserve">‘</w:t>
-      </w:r>
-      <w:r>
-        <w:t xml:space="preserve">dials</w:t>
-      </w:r>
-      <w:r>
-        <w:t xml:space="preserve">’</w:t>
-      </w:r>
-      <w:r>
-        <w:t xml:space="preserve"> </w:t>
-      </w:r>
-      <w:r>
-        <w:t xml:space="preserve">are described (some more in direct control than others) for job investment:</w:t>
-      </w:r>
-    </w:p>
-    <w:p>
-      <w:pPr>
         <w:numPr>
           <w:ilvl w:val="1"/>
           <w:numId w:val="1004"/>
         </w:numPr>
+      </w:pPr>
+      <w:r>
+        <w:t xml:space="preserve">1: Investment cost per job, averaging between £345-680 thousand from the literature, implies four to eight years for positive returns for an average SY job.</w:t>
+      </w:r>
+    </w:p>
+    <w:p>
+      <w:pPr>
         <w:pStyle w:val="Compact"/>
-      </w:pPr>
-      <w:r>
-        <w:t xml:space="preserve">1: Investment cost per job, averaging between £345-680 thousand from the literature, implies four to eight years for positive returns for an average SY job.</w:t>
-      </w:r>
-    </w:p>
-    <w:p>
-      <w:pPr>
         <w:numPr>
           <w:ilvl w:val="1"/>
           <w:numId w:val="1004"/>
         </w:numPr>
+      </w:pPr>
+      <w:r>
+        <w:t xml:space="preserve">2: Public/private ratio and</w:t>
+      </w:r>
+      <w:r>
+        <w:t xml:space="preserve"> </w:t>
+      </w:r>
+      <w:r>
+        <w:t xml:space="preserve">‘</w:t>
+      </w:r>
+      <w:r>
+        <w:t xml:space="preserve">crowding in</w:t>
+      </w:r>
+      <w:r>
+        <w:t xml:space="preserve">’</w:t>
+      </w:r>
+      <w:r>
+        <w:t xml:space="preserve"> </w:t>
+      </w:r>
+      <w:r>
+        <w:t xml:space="preserve">value. Several sources suggest a 1:3 ratio is achievable, meaning on average a SY job would on average be a public investment of between £115,000 and £225,000.</w:t>
+      </w:r>
+    </w:p>
+    <w:p>
+      <w:pPr>
         <w:pStyle w:val="Compact"/>
-      </w:pPr>
-      <w:r>
-        <w:t xml:space="preserve">2: Public/private ratio and</w:t>
-      </w:r>
-      <w:r>
-        <w:t xml:space="preserve"> </w:t>
-      </w:r>
-      <w:r>
-        <w:t xml:space="preserve">‘</w:t>
-      </w:r>
-      <w:r>
-        <w:t xml:space="preserve">crowding in</w:t>
-      </w:r>
-      <w:r>
-        <w:t xml:space="preserve">’</w:t>
-      </w:r>
-      <w:r>
-        <w:t xml:space="preserve"> </w:t>
-      </w:r>
-      <w:r>
-        <w:t xml:space="preserve">value. Several sources suggest a 1:3 ratio is achievable, meaning on average a SY job would on average be a public investment of between £115,000 and £225,000.</w:t>
-      </w:r>
-    </w:p>
-    <w:p>
-      <w:pPr>
         <w:numPr>
           <w:ilvl w:val="1"/>
           <w:numId w:val="1004"/>
         </w:numPr>
+      </w:pPr>
+      <w:r>
+        <w:t xml:space="preserve">3: Sector investment choices, including mix of job vs capital investment, and what difference that could make e.g. for SY’s manufacturing with low average productivity.</w:t>
+      </w:r>
+    </w:p>
+    <w:p>
+      <w:pPr>
         <w:pStyle w:val="Compact"/>
-      </w:pPr>
-      <w:r>
-        <w:t xml:space="preserve">3: Sector investment choices, including mix of job vs capital investment, and what difference that could make e.g. for SY’s manufacturing with low average productivity.</w:t>
-      </w:r>
-    </w:p>
-    <w:p>
-      <w:pPr>
         <w:numPr>
           <w:ilvl w:val="1"/>
           <w:numId w:val="1004"/>
         </w:numPr>
+      </w:pPr>
+      <w:r>
+        <w:t xml:space="preserve">4: Balance of investment focus: including supporting entirely new firms, existing SMEs to increase productivity, defining</w:t>
+      </w:r>
+      <w:r>
+        <w:t xml:space="preserve"> </w:t>
+      </w:r>
+      <w:r>
+        <w:t xml:space="preserve">‘</w:t>
+      </w:r>
+      <w:r>
+        <w:t xml:space="preserve">good growth</w:t>
+      </w:r>
+      <w:r>
+        <w:t xml:space="preserve">’</w:t>
+      </w:r>
+      <w:r>
+        <w:t xml:space="preserve"> </w:t>
+      </w:r>
+      <w:r>
+        <w:t xml:space="preserve">investment (see above), balance of investment in new jobs vs skills improvements. In this dial, sector linkages could be included: understanding how cross-sector knowledge can boost ROI.</w:t>
+      </w:r>
+    </w:p>
+    <w:p>
+      <w:pPr>
         <w:pStyle w:val="Compact"/>
-      </w:pPr>
-      <w:r>
-        <w:t xml:space="preserve">4: Balance of investment focus: including supporting entirely new firms, existing SMEs to increase productivity, defining</w:t>
-      </w:r>
-      <w:r>
-        <w:t xml:space="preserve"> </w:t>
-      </w:r>
-      <w:r>
-        <w:t xml:space="preserve">‘</w:t>
-      </w:r>
-      <w:r>
-        <w:t xml:space="preserve">good growth</w:t>
-      </w:r>
-      <w:r>
-        <w:t xml:space="preserve">’</w:t>
-      </w:r>
-      <w:r>
-        <w:t xml:space="preserve"> </w:t>
-      </w:r>
-      <w:r>
-        <w:t xml:space="preserve">investment (see above), balance of investment in new jobs vs skills improvements. In this dial, sector linkages could be included: understanding how cross-sector knowledge can boost ROI.</w:t>
-      </w:r>
-    </w:p>
-    <w:p>
-      <w:pPr>
         <w:numPr>
           <w:ilvl w:val="1"/>
           <w:numId w:val="1004"/>
         </w:numPr>
-        <w:pStyle w:val="Compact"/>
       </w:pPr>
       <w:r>
         <w:t xml:space="preserve">5: Spatial outcomes: the least in control of policy, but vital - what balance of jobs and skills improvements within SY (with all the GVA accounting implications) versus outward focus on higher productivity jobs more likely to be tradeable and attract more distant workers?</w:t>
@@ -414,35 +414,35 @@
     </w:p>
     <w:p>
       <w:pPr>
+        <w:pStyle w:val="Compact"/>
         <w:numPr>
           <w:ilvl w:val="0"/>
           <w:numId w:val="1005"/>
         </w:numPr>
+      </w:pPr>
+      <w:r>
+        <w:t xml:space="preserve">What factors are important to using investment to grow South Yorkshire’s (hereafter SY) different economic sectors?</w:t>
+      </w:r>
+    </w:p>
+    <w:p>
+      <w:pPr>
         <w:pStyle w:val="Compact"/>
-      </w:pPr>
-      <w:r>
-        <w:t xml:space="preserve">What factors are important to using investment to grow South Yorkshire’s (hereafter SY) different economic sectors?</w:t>
-      </w:r>
-    </w:p>
-    <w:p>
-      <w:pPr>
         <w:numPr>
           <w:ilvl w:val="0"/>
           <w:numId w:val="1005"/>
         </w:numPr>
+      </w:pPr>
+      <w:r>
+        <w:t xml:space="preserve">How might GVA outcomes differ depending on those investment choices?</w:t>
+      </w:r>
+    </w:p>
+    <w:p>
+      <w:pPr>
         <w:pStyle w:val="Compact"/>
-      </w:pPr>
-      <w:r>
-        <w:t xml:space="preserve">How might GVA outcomes differ depending on those investment choices?</w:t>
-      </w:r>
-    </w:p>
-    <w:p>
-      <w:pPr>
         <w:numPr>
           <w:ilvl w:val="0"/>
           <w:numId w:val="1005"/>
         </w:numPr>
-        <w:pStyle w:val="Compact"/>
       </w:pPr>
       <w:r>
         <w:t xml:space="preserve">What role could green jobs play in this picture?</w:t>
@@ -539,104 +539,104 @@
     </w:p>
     <w:p>
       <w:pPr>
+        <w:pStyle w:val="Compact"/>
         <w:numPr>
           <w:ilvl w:val="0"/>
           <w:numId w:val="1006"/>
         </w:numPr>
+      </w:pPr>
+      <w:r>
+        <w:t xml:space="preserve">The</w:t>
+      </w:r>
+      <w:r>
+        <w:t xml:space="preserve"> </w:t>
+      </w:r>
+      <w:r>
+        <w:t xml:space="preserve">‘</w:t>
+      </w:r>
+      <w:r>
+        <w:t xml:space="preserve">Low Carbon and Renewable Energy</w:t>
+      </w:r>
+      <w:r>
+        <w:t xml:space="preserve">’</w:t>
+      </w:r>
+      <w:r>
+        <w:t xml:space="preserve"> </w:t>
+      </w:r>
+      <w:r>
+        <w:t xml:space="preserve">economy in the UK and its implications for SY.</w:t>
+      </w:r>
+    </w:p>
+    <w:p>
+      <w:pPr>
         <w:pStyle w:val="Compact"/>
-      </w:pPr>
-      <w:r>
-        <w:t xml:space="preserve">The</w:t>
-      </w:r>
-      <w:r>
-        <w:t xml:space="preserve"> </w:t>
-      </w:r>
-      <w:r>
-        <w:t xml:space="preserve">‘</w:t>
-      </w:r>
-      <w:r>
-        <w:t xml:space="preserve">Low Carbon and Renewable Energy</w:t>
-      </w:r>
-      <w:r>
-        <w:t xml:space="preserve">’</w:t>
-      </w:r>
-      <w:r>
-        <w:t xml:space="preserve"> </w:t>
-      </w:r>
-      <w:r>
-        <w:t xml:space="preserve">economy in the UK and its implications for SY.</w:t>
-      </w:r>
-    </w:p>
-    <w:p>
-      <w:pPr>
         <w:numPr>
           <w:ilvl w:val="0"/>
           <w:numId w:val="1006"/>
         </w:numPr>
+      </w:pPr>
+      <w:r>
+        <w:t xml:space="preserve">The current picture of SY’s sectoral productivity and what that implies for investment choices.</w:t>
+      </w:r>
+    </w:p>
+    <w:p>
+      <w:pPr>
         <w:pStyle w:val="Compact"/>
-      </w:pPr>
-      <w:r>
-        <w:t xml:space="preserve">The current picture of SY’s sectoral productivity and what that implies for investment choices.</w:t>
-      </w:r>
-    </w:p>
-    <w:p>
-      <w:pPr>
         <w:numPr>
           <w:ilvl w:val="0"/>
           <w:numId w:val="1006"/>
         </w:numPr>
+      </w:pPr>
+      <w:r>
+        <w:t xml:space="preserve">A look at how GVA growth and job number change can vary, to consider what kind of job and sector growth to aim for.</w:t>
+      </w:r>
+    </w:p>
+    <w:p>
+      <w:pPr>
         <w:pStyle w:val="Compact"/>
-      </w:pPr>
-      <w:r>
-        <w:t xml:space="preserve">A look at how GVA growth and job number change can vary, to consider what kind of job and sector growth to aim for.</w:t>
-      </w:r>
-    </w:p>
-    <w:p>
-      <w:pPr>
         <w:numPr>
           <w:ilvl w:val="0"/>
           <w:numId w:val="1006"/>
         </w:numPr>
+      </w:pPr>
+      <w:r>
+        <w:t xml:space="preserve">Modelling</w:t>
+      </w:r>
+      <w:r>
+        <w:t xml:space="preserve"> </w:t>
+      </w:r>
+      <w:r>
+        <w:t xml:space="preserve">‘</w:t>
+      </w:r>
+      <w:r>
+        <w:t xml:space="preserve">adding a new job to SY</w:t>
+      </w:r>
+      <w:r>
+        <w:t xml:space="preserve">’</w:t>
+      </w:r>
+      <w:r>
+        <w:t xml:space="preserve">: a first approximation to explore how the location, activity status and skill levels of workers interacts with new jobs and where GVA gets counted.</w:t>
+      </w:r>
+    </w:p>
+    <w:p>
+      <w:pPr>
         <w:pStyle w:val="Compact"/>
-      </w:pPr>
-      <w:r>
-        <w:t xml:space="preserve">Modelling</w:t>
-      </w:r>
-      <w:r>
-        <w:t xml:space="preserve"> </w:t>
-      </w:r>
-      <w:r>
-        <w:t xml:space="preserve">‘</w:t>
-      </w:r>
-      <w:r>
-        <w:t xml:space="preserve">adding a new job to SY</w:t>
-      </w:r>
-      <w:r>
-        <w:t xml:space="preserve">’</w:t>
-      </w:r>
-      <w:r>
-        <w:t xml:space="preserve">: a first approximation to explore how the location, activity status and skill levels of workers interacts with new jobs and where GVA gets counted.</w:t>
-      </w:r>
-    </w:p>
-    <w:p>
-      <w:pPr>
         <w:numPr>
           <w:ilvl w:val="0"/>
           <w:numId w:val="1006"/>
         </w:numPr>
+      </w:pPr>
+      <w:r>
+        <w:t xml:space="preserve">Bringing all that together: identifying the dials to turn</w:t>
+      </w:r>
+    </w:p>
+    <w:p>
+      <w:pPr>
         <w:pStyle w:val="Compact"/>
-      </w:pPr>
-      <w:r>
-        <w:t xml:space="preserve">Bringing all that together: identifying the dials to turn</w:t>
-      </w:r>
-    </w:p>
-    <w:p>
-      <w:pPr>
         <w:numPr>
           <w:ilvl w:val="0"/>
           <w:numId w:val="1006"/>
         </w:numPr>
-        <w:pStyle w:val="Compact"/>
       </w:pPr>
       <w:r>
         <w:t xml:space="preserve">How to measure outcomes from those dials, how to measure</w:t>
@@ -766,9 +766,8 @@
       <w:tblPr>
         <w:tblStyle w:val="Table"/>
         <w:tblW w:type="pct" w:w="5000"/>
+        <w:tblLayout w:type="fixed"/>
         <w:tblLook w:firstRow="0" w:lastRow="0" w:firstColumn="0" w:lastColumn="0" w:noHBand="0" w:noVBand="0" w:val="0000"/>
-        <w:jc w:val="start"/>
-        <w:tblLayout w:type="fixed"/>
       </w:tblPr>
       <w:tblGrid>
         <w:gridCol w:w="7920"/>
@@ -895,9 +894,8 @@
       <w:tblPr>
         <w:tblStyle w:val="Table"/>
         <w:tblW w:type="pct" w:w="5000"/>
+        <w:tblLayout w:type="fixed"/>
         <w:tblLook w:firstRow="0" w:lastRow="0" w:firstColumn="0" w:lastColumn="0" w:noHBand="0" w:noVBand="0" w:val="0000"/>
-        <w:jc w:val="start"/>
-        <w:tblLayout w:type="fixed"/>
       </w:tblPr>
       <w:tblGrid>
         <w:gridCol w:w="7920"/>
@@ -1049,35 +1047,35 @@
     </w:p>
     <w:p>
       <w:pPr>
+        <w:pStyle w:val="Compact"/>
         <w:numPr>
           <w:ilvl w:val="0"/>
           <w:numId w:val="1007"/>
         </w:numPr>
+      </w:pPr>
+      <w:r>
+        <w:t xml:space="preserve">The top two green job sectors in LCREE, manufacturing and construction, have very different productivity per job in SY. Manufacturing has remained at or near the lowest end of all places in the UK. There will of course be firms with much higher productivity, but on average it has been stuck for some time. Construction has been much more typical of the UK as a whole, with some ups and downs. Another important green sector, scientific and technical jobs, while relatively low, has seen recent productivity increases when compared with the rest of the UK.</w:t>
+      </w:r>
+    </w:p>
+    <w:p>
+      <w:pPr>
         <w:pStyle w:val="Compact"/>
-      </w:pPr>
-      <w:r>
-        <w:t xml:space="preserve">The top two green job sectors in LCREE, manufacturing and construction, have very different productivity per job in SY. Manufacturing has remained at or near the lowest end of all places in the UK. There will of course be firms with much higher productivity, but on average it has been stuck for some time. Construction has been much more typical of the UK as a whole, with some ups and downs. Another important green sector, scientific and technical jobs, while relatively low, has seen recent productivity increases when compared with the rest of the UK.</w:t>
-      </w:r>
-    </w:p>
-    <w:p>
-      <w:pPr>
         <w:numPr>
           <w:ilvl w:val="0"/>
           <w:numId w:val="1007"/>
         </w:numPr>
+      </w:pPr>
+      <w:r>
+        <w:t xml:space="preserve">ICT, as well as being a highly productive sector, has seen SY’s output per job rapidly climb into the highest places in the UK.</w:t>
+      </w:r>
+    </w:p>
+    <w:p>
+      <w:pPr>
         <w:pStyle w:val="Compact"/>
-      </w:pPr>
-      <w:r>
-        <w:t xml:space="preserve">ICT, as well as being a highly productive sector, has seen SY’s output per job rapidly climb into the highest places in the UK.</w:t>
-      </w:r>
-    </w:p>
-    <w:p>
-      <w:pPr>
         <w:numPr>
           <w:ilvl w:val="0"/>
           <w:numId w:val="1007"/>
         </w:numPr>
-        <w:pStyle w:val="Compact"/>
       </w:pPr>
       <w:r>
         <w:t xml:space="preserve">Education has been consistently productive in SY, and continues to increase relative to other places in the UK.</w:t>
@@ -1087,9 +1085,8 @@
       <w:tblPr>
         <w:tblStyle w:val="Table"/>
         <w:tblW w:type="pct" w:w="5000"/>
+        <w:tblLayout w:type="fixed"/>
         <w:tblLook w:firstRow="0" w:lastRow="0" w:firstColumn="0" w:lastColumn="0" w:noHBand="0" w:noVBand="0" w:val="0000"/>
-        <w:jc w:val="start"/>
-        <w:tblLayout w:type="fixed"/>
       </w:tblPr>
       <w:tblGrid>
         <w:gridCol w:w="7920"/>
@@ -1202,9 +1199,8 @@
       <w:tblPr>
         <w:tblStyle w:val="Table"/>
         <w:tblW w:type="pct" w:w="5000"/>
+        <w:tblLayout w:type="fixed"/>
         <w:tblLook w:firstRow="0" w:lastRow="0" w:firstColumn="0" w:lastColumn="0" w:noHBand="0" w:noVBand="0" w:val="0000"/>
-        <w:jc w:val="start"/>
-        <w:tblLayout w:type="fixed"/>
       </w:tblPr>
       <w:tblGrid>
         <w:gridCol w:w="7920"/>
@@ -1368,26 +1364,26 @@
     </w:p>
     <w:p>
       <w:pPr>
+        <w:pStyle w:val="Compact"/>
         <w:numPr>
           <w:ilvl w:val="0"/>
           <w:numId w:val="1008"/>
         </w:numPr>
+      </w:pPr>
+      <w:r>
+        <w:t xml:space="preserve">Percent change of total manufacturing GVA over time is plotted against percent change in job count, for all ITL2 zones including South Yorkshire (in blue).</w:t>
+      </w:r>
+      <w:r>
+        <w:br/>
+      </w:r>
+    </w:p>
+    <w:p>
+      <w:pPr>
         <w:pStyle w:val="Compact"/>
-      </w:pPr>
-      <w:r>
-        <w:t xml:space="preserve">Percent change of total manufacturing GVA over time is plotted against percent change in job count, for all ITL2 zones including South Yorkshire (in blue).</w:t>
-      </w:r>
-      <w:r>
-        <w:br/>
-      </w:r>
-    </w:p>
-    <w:p>
-      <w:pPr>
         <w:numPr>
           <w:ilvl w:val="0"/>
           <w:numId w:val="1008"/>
         </w:numPr>
-        <w:pStyle w:val="Compact"/>
       </w:pPr>
       <w:r>
         <w:t xml:space="preserve">Labels are coloured by</w:t>
@@ -1433,8 +1429,8 @@
       </w:r>
       <w:r>
         <w:rPr>
+          <w:b/>
           <w:bCs/>
-          <w:b/>
         </w:rPr>
         <w:t xml:space="preserve">and</w:t>
       </w:r>
@@ -1465,11 +1461,11 @@
     </w:p>
     <w:p>
       <w:pPr>
+        <w:pStyle w:val="Compact"/>
         <w:numPr>
           <w:ilvl w:val="0"/>
           <w:numId w:val="1008"/>
         </w:numPr>
-        <w:pStyle w:val="Compact"/>
       </w:pPr>
       <w:r>
         <w:t xml:space="preserve">Arrows in the dark diagonal section of the plot show places where productivity (GVA per job, shown in the labels)</w:t>
@@ -1479,8 +1475,8 @@
       </w:r>
       <w:r>
         <w:rPr>
+          <w:b/>
           <w:bCs/>
-          <w:b/>
         </w:rPr>
         <w:t xml:space="preserve">increased</w:t>
       </w:r>
@@ -1492,8 +1488,8 @@
       </w:r>
       <w:r>
         <w:rPr>
+          <w:b/>
           <w:bCs/>
-          <w:b/>
         </w:rPr>
         <w:t xml:space="preserve">both</w:t>
       </w:r>
@@ -1523,8 +1519,8 @@
       </w:r>
       <w:r>
         <w:rPr>
+          <w:b/>
           <w:bCs/>
-          <w:b/>
         </w:rPr>
         <w:t xml:space="preserve">dropped</w:t>
       </w:r>
@@ -1635,9 +1631,8 @@
       <w:tblPr>
         <w:tblStyle w:val="Table"/>
         <w:tblW w:type="pct" w:w="5000"/>
+        <w:tblLayout w:type="fixed"/>
         <w:tblLook w:firstRow="0" w:lastRow="0" w:firstColumn="0" w:lastColumn="0" w:noHBand="0" w:noVBand="0" w:val="0000"/>
-        <w:jc w:val="start"/>
-        <w:tblLayout w:type="fixed"/>
       </w:tblPr>
       <w:tblGrid>
         <w:gridCol w:w="7920"/>
@@ -1733,8 +1728,8 @@
       </w:r>
       <w:r>
         <w:rPr>
+          <w:i/>
           <w:iCs/>
-          <w:i/>
         </w:rPr>
         <w:t xml:space="preserve">new</w:t>
       </w:r>
@@ -1789,8 +1784,8 @@
       </w:r>
       <w:r>
         <w:rPr>
+          <w:i/>
           <w:iCs/>
-          <w:i/>
         </w:rPr>
         <w:t xml:space="preserve">all</w:t>
       </w:r>
@@ -1832,8 +1827,8 @@
       </w:pPr>
       <w:r>
         <w:rPr>
+          <w:b/>
           <w:bCs/>
-          <w:b/>
         </w:rPr>
         <w:t xml:space="preserve">The table below repeats these simulations for all broad SIC sections</w:t>
       </w:r>
@@ -1846,11 +1841,11 @@
     </w:p>
     <w:p>
       <w:pPr>
+        <w:pStyle w:val="Compact"/>
         <w:numPr>
           <w:ilvl w:val="0"/>
           <w:numId w:val="1009"/>
         </w:numPr>
-        <w:pStyle w:val="Compact"/>
       </w:pPr>
       <w:r>
         <w:t xml:space="preserve">The first value column -</w:t>
@@ -1860,8 +1855,8 @@
       </w:r>
       <w:r>
         <w:rPr>
+          <w:b/>
           <w:bCs/>
-          <w:b/>
         </w:rPr>
         <w:t xml:space="preserve">av new job GVA</w:t>
       </w:r>
@@ -1876,8 +1871,8 @@
       </w:r>
       <w:r>
         <w:rPr>
+          <w:b/>
           <w:bCs/>
-          <w:b/>
         </w:rPr>
         <w:t xml:space="preserve">av net GVA</w:t>
       </w:r>
@@ -1892,8 +1887,8 @@
       </w:r>
       <w:r>
         <w:rPr>
+          <w:i/>
           <w:iCs/>
-          <w:i/>
         </w:rPr>
         <w:t xml:space="preserve">within</w:t>
       </w:r>
@@ -1908,8 +1903,8 @@
       </w:r>
       <w:r>
         <w:rPr>
+          <w:b/>
           <w:bCs/>
-          <w:b/>
         </w:rPr>
         <w:t xml:space="preserve">percent GVA gained</w:t>
       </w:r>
@@ -1922,35 +1917,35 @@
     </w:p>
     <w:p>
       <w:pPr>
+        <w:pStyle w:val="Compact"/>
         <w:numPr>
           <w:ilvl w:val="0"/>
           <w:numId w:val="1009"/>
         </w:numPr>
+      </w:pPr>
+      <w:r>
+        <w:t xml:space="preserve">Unsurprisingly, new jobs in higher productivity sectors tend to have higher average proportional GVA gains, if workers with SY move to those jobs.</w:t>
+      </w:r>
+    </w:p>
+    <w:p>
+      <w:pPr>
         <w:pStyle w:val="Compact"/>
-      </w:pPr>
-      <w:r>
-        <w:t xml:space="preserve">Unsurprisingly, new jobs in higher productivity sectors tend to have higher average proportional GVA gains, if workers with SY move to those jobs.</w:t>
-      </w:r>
-    </w:p>
-    <w:p>
-      <w:pPr>
         <w:numPr>
           <w:ilvl w:val="0"/>
           <w:numId w:val="1009"/>
         </w:numPr>
+      </w:pPr>
+      <w:r>
+        <w:t xml:space="preserve">As already mentioned, GVA in the top three sectors of power, real estate and mining are perhaps misleading due to the their oversized apparent productivity per worker (based e.g. for power on very high profit rates), and they have very small job numbers overall (see job count and % in table). It would be necessary to more fully understand productivity in power firms to better estimate what role they could play in SY growth and green growth, but in terms of jobs numbers, there isn’t a large base to grow from currently.</w:t>
+      </w:r>
+    </w:p>
+    <w:p>
+      <w:pPr>
         <w:pStyle w:val="Compact"/>
-      </w:pPr>
-      <w:r>
-        <w:t xml:space="preserve">As already mentioned, GVA in the top three sectors of power, real estate and mining are perhaps misleading due to the their oversized apparent productivity per worker (based e.g. for power on very high profit rates), and they have very small job numbers overall (see job count and % in table). It would be necessary to more fully understand productivity in power firms to better estimate what role they could play in SY growth and green growth, but in terms of jobs numbers, there isn’t a large base to grow from currently.</w:t>
-      </w:r>
-    </w:p>
-    <w:p>
-      <w:pPr>
         <w:numPr>
           <w:ilvl w:val="0"/>
           <w:numId w:val="1009"/>
         </w:numPr>
-        <w:pStyle w:val="Compact"/>
       </w:pPr>
       <w:r>
         <w:t xml:space="preserve">For all other sectors with more straightforward GVA per worker (from ICT to transport) the absolute and percent net gains are higher the more productive the sector is. Built into the assumptions is that a higher productivity job would more likely release a larger chain of spillovers to other jobs within SY, so internal gains should be higher. Compare ICT to transport directly: a new ICT job could add £105,000, netting £35,000 on average if from internal job shifts. Compare to transport: as</w:t>
@@ -1975,11 +1970,11 @@
     </w:p>
     <w:p>
       <w:pPr>
+        <w:pStyle w:val="Compact"/>
         <w:numPr>
           <w:ilvl w:val="0"/>
           <w:numId w:val="1009"/>
         </w:numPr>
-        <w:pStyle w:val="Compact"/>
       </w:pPr>
       <w:r>
         <w:t xml:space="preserve">This data implies that there is an inverse relationship between sector productivity and the ratio of purely new job to net new job value. For example, a new job in transport attracting someone from outside SY could bring in ten times more GVA than if displacing another SY job. That ratio drops rapidly for higher productivity jobs, with new ICT jobs filled external to SY bringing in three times more GVA than if net. But note from the table, the absolute amounts are so much larger for more productive posts.</w:t>
@@ -5418,78 +5413,78 @@
     </w:p>
     <w:p>
       <w:pPr>
+        <w:pStyle w:val="Compact"/>
         <w:numPr>
           <w:ilvl w:val="0"/>
           <w:numId w:val="1010"/>
         </w:numPr>
+      </w:pPr>
+      <w:r>
+        <w:t xml:space="preserve">The gains from different types of investment, given some key assumptions</w:t>
+      </w:r>
+    </w:p>
+    <w:p>
+      <w:pPr>
         <w:pStyle w:val="Compact"/>
-      </w:pPr>
-      <w:r>
-        <w:t xml:space="preserve">The gains from different types of investment, given some key assumptions</w:t>
-      </w:r>
-    </w:p>
-    <w:p>
-      <w:pPr>
         <w:numPr>
           <w:ilvl w:val="0"/>
           <w:numId w:val="1010"/>
         </w:numPr>
+      </w:pPr>
+      <w:r>
+        <w:t xml:space="preserve">How the balance of geographical forces can impact on productivity outcomes (both in GVA accounting terms and otherwise)</w:t>
+      </w:r>
+    </w:p>
+    <w:p>
+      <w:pPr>
         <w:pStyle w:val="Compact"/>
-      </w:pPr>
-      <w:r>
-        <w:t xml:space="preserve">How the balance of geographical forces can impact on productivity outcomes (both in GVA accounting terms and otherwise)</w:t>
-      </w:r>
-    </w:p>
-    <w:p>
-      <w:pPr>
         <w:numPr>
           <w:ilvl w:val="0"/>
           <w:numId w:val="1010"/>
         </w:numPr>
+      </w:pPr>
+      <w:r>
+        <w:t xml:space="preserve">Implications from this analysis for green job investment</w:t>
+      </w:r>
+    </w:p>
+    <w:p>
+      <w:pPr>
+        <w:pStyle w:val="FirstParagraph"/>
+      </w:pPr>
+      <w:r>
+        <w:t xml:space="preserve">Consider a series of</w:t>
+      </w:r>
+      <w:r>
+        <w:t xml:space="preserve"> </w:t>
+      </w:r>
+      <w:r>
+        <w:t xml:space="preserve">‘</w:t>
+      </w:r>
+      <w:r>
+        <w:t xml:space="preserve">dials</w:t>
+      </w:r>
+      <w:r>
+        <w:t xml:space="preserve">’</w:t>
+      </w:r>
+      <w:r>
+        <w:t xml:space="preserve"> </w:t>
+      </w:r>
+      <w:r>
+        <w:t xml:space="preserve">that policy could turn, and also a series of variables that policy has less direct control over but can be treated as dials for now. The outcome of those can then be measured (though some discussion of the vital importance of measure choice is below).</w:t>
+      </w:r>
+    </w:p>
+    <w:p>
+      <w:pPr>
         <w:pStyle w:val="Compact"/>
-      </w:pPr>
-      <w:r>
-        <w:t xml:space="preserve">Implications from this analysis for green job investment</w:t>
-      </w:r>
-    </w:p>
-    <w:p>
-      <w:pPr>
-        <w:pStyle w:val="FirstParagraph"/>
-      </w:pPr>
-      <w:r>
-        <w:t xml:space="preserve">Consider a series of</w:t>
-      </w:r>
-      <w:r>
-        <w:t xml:space="preserve"> </w:t>
-      </w:r>
-      <w:r>
-        <w:t xml:space="preserve">‘</w:t>
-      </w:r>
-      <w:r>
-        <w:t xml:space="preserve">dials</w:t>
-      </w:r>
-      <w:r>
-        <w:t xml:space="preserve">’</w:t>
-      </w:r>
-      <w:r>
-        <w:t xml:space="preserve"> </w:t>
-      </w:r>
-      <w:r>
-        <w:t xml:space="preserve">that policy could turn, and also a series of variables that policy has less direct control over but can be treated as dials for now. The outcome of those can then be measured (though some discussion of the vital importance of measure choice is below).</w:t>
-      </w:r>
-    </w:p>
-    <w:p>
-      <w:pPr>
         <w:numPr>
           <w:ilvl w:val="0"/>
           <w:numId w:val="1011"/>
         </w:numPr>
-        <w:pStyle w:val="Compact"/>
       </w:pPr>
       <w:r>
         <w:rPr>
+          <w:b/>
           <w:bCs/>
-          <w:b/>
         </w:rPr>
         <w:t xml:space="preserve">Dial 1: Cost of investment per new job.</w:t>
       </w:r>
@@ -5520,44 +5515,44 @@
     </w:p>
     <w:p>
       <w:pPr>
+        <w:pStyle w:val="Compact"/>
         <w:numPr>
           <w:ilvl w:val="0"/>
           <w:numId w:val="1011"/>
         </w:numPr>
-        <w:pStyle w:val="Compact"/>
       </w:pPr>
       <w:r>
         <w:rPr>
+          <w:b/>
           <w:bCs/>
-          <w:b/>
         </w:rPr>
         <w:t xml:space="preserve">Dial 2: Public investment cost and the ratio to private</w:t>
       </w:r>
       <w:r>
         <w:rPr>
+          <w:b/>
           <w:bCs/>
+        </w:rPr>
+        <w:t xml:space="preserve"> </w:t>
+      </w:r>
+      <w:r>
+        <w:rPr>
           <w:b/>
-        </w:rPr>
-        <w:t xml:space="preserve"> </w:t>
-      </w:r>
-      <w:r>
-        <w:rPr>
           <w:bCs/>
-          <w:b/>
         </w:rPr>
         <w:t xml:space="preserve">‘</w:t>
       </w:r>
       <w:r>
         <w:rPr>
+          <w:b/>
           <w:bCs/>
-          <w:b/>
         </w:rPr>
         <w:t xml:space="preserve">crowding in</w:t>
       </w:r>
       <w:r>
         <w:rPr>
+          <w:b/>
           <w:bCs/>
-          <w:b/>
         </w:rPr>
         <w:t xml:space="preserve">’</w:t>
       </w:r>
@@ -5569,8 +5564,8 @@
       </w:r>
       <w:r>
         <w:rPr>
+          <w:i/>
           <w:iCs/>
-          <w:i/>
         </w:rPr>
         <w:t xml:space="preserve">on average</w:t>
       </w:r>
@@ -5583,16 +5578,16 @@
     </w:p>
     <w:p>
       <w:pPr>
+        <w:pStyle w:val="Compact"/>
         <w:numPr>
           <w:ilvl w:val="0"/>
           <w:numId w:val="1011"/>
         </w:numPr>
-        <w:pStyle w:val="Compact"/>
       </w:pPr>
       <w:r>
         <w:rPr>
+          <w:b/>
           <w:bCs/>
-          <w:b/>
         </w:rPr>
         <w:t xml:space="preserve">Dial 3: sector investment choices</w:t>
       </w:r>
@@ -5604,8 +5599,8 @@
       </w:r>
       <w:r>
         <w:rPr>
+          <w:i/>
           <w:iCs/>
-          <w:i/>
         </w:rPr>
         <w:t xml:space="preserve">within</w:t>
       </w:r>
@@ -5620,8 +5615,8 @@
       </w:r>
       <w:r>
         <w:rPr>
+          <w:b/>
           <w:bCs/>
-          <w:b/>
         </w:rPr>
         <w:t xml:space="preserve">average</w:t>
       </w:r>
@@ -5634,16 +5629,16 @@
     </w:p>
     <w:p>
       <w:pPr>
+        <w:pStyle w:val="Compact"/>
         <w:numPr>
           <w:ilvl w:val="0"/>
           <w:numId w:val="1011"/>
         </w:numPr>
-        <w:pStyle w:val="Compact"/>
       </w:pPr>
       <w:r>
         <w:rPr>
+          <w:b/>
           <w:bCs/>
-          <w:b/>
         </w:rPr>
         <w:t xml:space="preserve">Dial 4: the balance of investment focus</w:t>
       </w:r>
@@ -5671,11 +5666,11 @@
     </w:p>
     <w:p>
       <w:pPr>
+        <w:pStyle w:val="Compact"/>
         <w:numPr>
           <w:ilvl w:val="1"/>
           <w:numId w:val="1012"/>
         </w:numPr>
-        <w:pStyle w:val="Compact"/>
       </w:pPr>
       <w:r>
         <w:t xml:space="preserve">This dial also covers investment in supporting SY people out of inactivity into employment, education or training. It needs special consideration in how it leads to measured outcomes, because it could potentially</w:t>
@@ -5685,8 +5680,8 @@
       </w:r>
       <w:r>
         <w:rPr>
+          <w:i/>
           <w:iCs/>
-          <w:i/>
         </w:rPr>
         <w:t xml:space="preserve">lower</w:t>
       </w:r>
@@ -5699,16 +5694,16 @@
     </w:p>
     <w:p>
       <w:pPr>
+        <w:pStyle w:val="Compact"/>
         <w:numPr>
           <w:ilvl w:val="0"/>
           <w:numId w:val="1011"/>
         </w:numPr>
-        <w:pStyle w:val="Compact"/>
       </w:pPr>
       <w:r>
         <w:rPr>
+          <w:b/>
           <w:bCs/>
-          <w:b/>
         </w:rPr>
         <w:t xml:space="preserve">Dial 5: the balance of pulling from SY’s existing workforce versus attracting external workers</w:t>
       </w:r>
@@ -5720,8 +5715,8 @@
       </w:r>
       <w:r>
         <w:rPr>
+          <w:i/>
           <w:iCs/>
-          <w:i/>
         </w:rPr>
         <w:t xml:space="preserve">average</w:t>
       </w:r>
@@ -5757,23 +5752,23 @@
     </w:p>
     <w:p>
       <w:pPr>
+        <w:pStyle w:val="Compact"/>
         <w:numPr>
           <w:ilvl w:val="0"/>
           <w:numId w:val="1013"/>
         </w:numPr>
+      </w:pPr>
+      <w:r>
+        <w:t xml:space="preserve">Different capital intensity for different jobs to be productive changes the investment picture. (Contrast ICT with manufacturing.)</w:t>
+      </w:r>
+    </w:p>
+    <w:p>
+      <w:pPr>
         <w:pStyle w:val="Compact"/>
-      </w:pPr>
-      <w:r>
-        <w:t xml:space="preserve">Different capital intensity for different jobs to be productive changes the investment picture. (Contrast ICT with manufacturing.)</w:t>
-      </w:r>
-    </w:p>
-    <w:p>
-      <w:pPr>
         <w:numPr>
           <w:ilvl w:val="0"/>
           <w:numId w:val="1013"/>
         </w:numPr>
-        <w:pStyle w:val="Compact"/>
       </w:pPr>
       <w:r>
         <w:t xml:space="preserve">“</w:t>
@@ -5814,8 +5809,8 @@
       </w:r>
       <w:r>
         <w:rPr>
+          <w:i/>
           <w:iCs/>
-          <w:i/>
         </w:rPr>
         <w:t xml:space="preserve">within</w:t>
       </w:r>
@@ -5939,11 +5934,11 @@
     </w:p>
     <w:p>
       <w:pPr>
+        <w:pStyle w:val="Compact"/>
         <w:numPr>
           <w:ilvl w:val="0"/>
           <w:numId w:val="1014"/>
         </w:numPr>
-        <w:pStyle w:val="Compact"/>
       </w:pPr>
       <w:r>
         <w:t xml:space="preserve">For every person moved from inactivity to a new job with below average productivity (which is likely in this case),</w:t>
@@ -5953,8 +5948,8 @@
       </w:r>
       <w:r>
         <w:rPr>
+          <w:b/>
           <w:bCs/>
-          <w:b/>
         </w:rPr>
         <w:t xml:space="preserve">South Yorkshire average output per worker will drop</w:t>
       </w:r>
@@ -5966,8 +5961,8 @@
       </w:r>
       <w:r>
         <w:rPr>
+          <w:i/>
           <w:iCs/>
-          <w:i/>
         </w:rPr>
         <w:t xml:space="preserve">increasing</w:t>
       </w:r>
@@ -6298,14 +6293,14 @@
 <file path=word/numbering.xml><?xml version="1.0" encoding="utf-8"?>
 <w:numbering xmlns:w="http://schemas.openxmlformats.org/wordprocessingml/2006/main">
   <w:abstractNum w:abstractNumId="990">
-    <w:nsid w:val="A990"/>
+    <w:nsid w:val="0000A990"/>
     <w:multiLevelType w:val="multilevel"/>
     <w:lvl w:ilvl="0">
       <w:numFmt w:val="bullet"/>
       <w:lvlText w:val=" "/>
       <w:lvlJc w:val="left"/>
       <w:pPr>
-        <w:ind w:left="720" w:hanging="480"/>
+        <w:ind w:left="720" w:hanging="360"/>
       </w:pPr>
     </w:lvl>
     <w:lvl w:ilvl="1">
@@ -6313,7 +6308,7 @@
       <w:lvlText w:val=" "/>
       <w:lvlJc w:val="left"/>
       <w:pPr>
-        <w:ind w:left="1440" w:hanging="480"/>
+        <w:ind w:left="1440" w:hanging="360"/>
       </w:pPr>
     </w:lvl>
     <w:lvl w:ilvl="2">
@@ -6321,7 +6316,7 @@
       <w:lvlText w:val=" "/>
       <w:lvlJc w:val="left"/>
       <w:pPr>
-        <w:ind w:left="2160" w:hanging="480"/>
+        <w:ind w:left="2160" w:hanging="360"/>
       </w:pPr>
     </w:lvl>
     <w:lvl w:ilvl="3">
@@ -6329,7 +6324,7 @@
       <w:lvlText w:val=" "/>
       <w:lvlJc w:val="left"/>
       <w:pPr>
-        <w:ind w:left="2880" w:hanging="480"/>
+        <w:ind w:left="2880" w:hanging="360"/>
       </w:pPr>
     </w:lvl>
     <w:lvl w:ilvl="4">
@@ -6337,7 +6332,7 @@
       <w:lvlText w:val=" "/>
       <w:lvlJc w:val="left"/>
       <w:pPr>
-        <w:ind w:left="3600" w:hanging="480"/>
+        <w:ind w:left="3600" w:hanging="360"/>
       </w:pPr>
     </w:lvl>
     <w:lvl w:ilvl="5">
@@ -6345,7 +6340,7 @@
       <w:lvlText w:val=" "/>
       <w:lvlJc w:val="left"/>
       <w:pPr>
-        <w:ind w:left="4320" w:hanging="480"/>
+        <w:ind w:left="4320" w:hanging="360"/>
       </w:pPr>
     </w:lvl>
     <w:lvl w:ilvl="6">
@@ -6353,7 +6348,7 @@
       <w:lvlText w:val=" "/>
       <w:lvlJc w:val="left"/>
       <w:pPr>
-        <w:ind w:left="5040" w:hanging="480"/>
+        <w:ind w:left="5040" w:hanging="360"/>
       </w:pPr>
     </w:lvl>
     <w:lvl w:ilvl="7">
@@ -6361,7 +6356,7 @@
       <w:lvlText w:val=" "/>
       <w:lvlJc w:val="left"/>
       <w:pPr>
-        <w:ind w:left="5760" w:hanging="480"/>
+        <w:ind w:left="5760" w:hanging="360"/>
       </w:pPr>
     </w:lvl>
     <w:lvl w:ilvl="8">
@@ -6369,88 +6364,115 @@
       <w:lvlText w:val=" "/>
       <w:lvlJc w:val="left"/>
       <w:pPr>
-        <w:ind w:left="6480" w:hanging="480"/>
+        <w:ind w:left="6480" w:hanging="360"/>
       </w:pPr>
     </w:lvl>
   </w:abstractNum>
   <w:abstractNum w:abstractNumId="991">
-    <w:nsid w:val="A991"/>
+    <w:nsid w:val="0000A991"/>
     <w:multiLevelType w:val="multilevel"/>
     <w:lvl w:ilvl="0">
       <w:numFmt w:val="bullet"/>
-      <w:lvlText w:val="•"/>
+      <w:lvlText w:val=""/>
       <w:lvlJc w:val="left"/>
       <w:pPr>
-        <w:ind w:left="720" w:hanging="480"/>
-      </w:pPr>
+        <w:ind w:left="720" w:hanging="360"/>
+      </w:pPr>
+      <w:rPr>
+        <w:rFonts w:ascii="Symbol" w:hAnsi="Symbol" w:cs="Symbol" w:hint="default"/>
+      </w:rPr>
     </w:lvl>
     <w:lvl w:ilvl="1">
       <w:numFmt w:val="bullet"/>
-      <w:lvlText w:val="–"/>
+      <w:lvlText w:val="o"/>
       <w:lvlJc w:val="left"/>
       <w:pPr>
-        <w:ind w:left="1440" w:hanging="480"/>
-      </w:pPr>
+        <w:ind w:left="1440" w:hanging="360"/>
+      </w:pPr>
+      <w:rPr>
+        <w:rFonts w:ascii="Courier New" w:hAnsi="Courier New" w:cs="Courier New" w:hint="default"/>
+      </w:rPr>
     </w:lvl>
     <w:lvl w:ilvl="2">
       <w:numFmt w:val="bullet"/>
-      <w:lvlText w:val="•"/>
+      <w:lvlText w:val=""/>
       <w:lvlJc w:val="left"/>
       <w:pPr>
-        <w:ind w:left="2160" w:hanging="480"/>
-      </w:pPr>
+        <w:ind w:left="2160" w:hanging="360"/>
+      </w:pPr>
+      <w:rPr>
+        <w:rFonts w:ascii="Wingdings" w:hAnsi="Wingdings" w:cs="Wingdings" w:hint="default"/>
+      </w:rPr>
     </w:lvl>
     <w:lvl w:ilvl="3">
       <w:numFmt w:val="bullet"/>
-      <w:lvlText w:val="–"/>
+      <w:lvlText w:val=""/>
       <w:lvlJc w:val="left"/>
       <w:pPr>
-        <w:ind w:left="2880" w:hanging="480"/>
-      </w:pPr>
+        <w:ind w:left="2880" w:hanging="360"/>
+      </w:pPr>
+      <w:rPr>
+        <w:rFonts w:ascii="Symbol" w:hAnsi="Symbol" w:cs="Symbol" w:hint="default"/>
+      </w:rPr>
     </w:lvl>
     <w:lvl w:ilvl="4">
       <w:numFmt w:val="bullet"/>
-      <w:lvlText w:val="•"/>
+      <w:lvlText w:val="o"/>
       <w:lvlJc w:val="left"/>
       <w:pPr>
-        <w:ind w:left="3600" w:hanging="480"/>
-      </w:pPr>
+        <w:ind w:left="3600" w:hanging="360"/>
+      </w:pPr>
+      <w:rPr>
+        <w:rFonts w:ascii="Courier New" w:hAnsi="Courier New" w:cs="Courier New" w:hint="default"/>
+      </w:rPr>
     </w:lvl>
     <w:lvl w:ilvl="5">
       <w:numFmt w:val="bullet"/>
-      <w:lvlText w:val="–"/>
+      <w:lvlText w:val=""/>
       <w:lvlJc w:val="left"/>
       <w:pPr>
-        <w:ind w:left="4320" w:hanging="480"/>
-      </w:pPr>
+        <w:ind w:left="4320" w:hanging="360"/>
+      </w:pPr>
+      <w:rPr>
+        <w:rFonts w:ascii="Wingdings" w:hAnsi="Wingdings" w:cs="Wingdings" w:hint="default"/>
+      </w:rPr>
     </w:lvl>
     <w:lvl w:ilvl="6">
       <w:numFmt w:val="bullet"/>
-      <w:lvlText w:val="•"/>
+      <w:lvlText w:val=""/>
       <w:lvlJc w:val="left"/>
       <w:pPr>
-        <w:ind w:left="5040" w:hanging="480"/>
-      </w:pPr>
+        <w:ind w:left="5040" w:hanging="360"/>
+      </w:pPr>
+      <w:rPr>
+        <w:rFonts w:ascii="Symbol" w:hAnsi="Symbol" w:cs="Symbol" w:hint="default"/>
+      </w:rPr>
     </w:lvl>
     <w:lvl w:ilvl="7">
       <w:numFmt w:val="bullet"/>
-      <w:lvlText w:val="–"/>
+      <w:lvlText w:val="o"/>
       <w:lvlJc w:val="left"/>
       <w:pPr>
-        <w:ind w:left="5760" w:hanging="480"/>
-      </w:pPr>
+        <w:ind w:left="5760" w:hanging="360"/>
+      </w:pPr>
+      <w:rPr>
+        <w:rFonts w:ascii="Courier New" w:hAnsi="Courier New" w:cs="Courier New" w:hint="default"/>
+      </w:rPr>
     </w:lvl>
     <w:lvl w:ilvl="8">
       <w:numFmt w:val="bullet"/>
-      <w:lvlText w:val="•"/>
+      <w:lvlText w:val=""/>
       <w:lvlJc w:val="left"/>
       <w:pPr>
-        <w:ind w:left="6480" w:hanging="480"/>
-      </w:pPr>
+        <w:ind w:left="6480" w:hanging="360"/>
+      </w:pPr>
+      <w:rPr>
+        <w:rFonts w:ascii="Wingdings" w:hAnsi="Wingdings" w:cs="Wingdings" w:hint="default"/>
+      </w:rPr>
     </w:lvl>
   </w:abstractNum>
   <w:abstractNum w:abstractNumId="99411">
-    <w:nsid w:val="A99411"/>
+    <w:nsid w:val="00A99411"/>
     <w:multiLevelType w:val="multilevel"/>
     <w:lvl w:ilvl="0">
       <w:start w:val="1"/>
@@ -6458,7 +6480,7 @@
       <w:lvlText w:val="%1."/>
       <w:lvlJc w:val="left"/>
       <w:pPr>
-        <w:ind w:left="720" w:hanging="480"/>
+        <w:ind w:left="720" w:hanging="360"/>
       </w:pPr>
     </w:lvl>
     <w:lvl w:ilvl="1">
@@ -6467,7 +6489,7 @@
       <w:lvlText w:val="%2."/>
       <w:lvlJc w:val="left"/>
       <w:pPr>
-        <w:ind w:left="1440" w:hanging="480"/>
+        <w:ind w:left="1440" w:hanging="360"/>
       </w:pPr>
     </w:lvl>
     <w:lvl w:ilvl="2">
@@ -6476,7 +6498,7 @@
       <w:lvlText w:val="%3."/>
       <w:lvlJc w:val="left"/>
       <w:pPr>
-        <w:ind w:left="2160" w:hanging="480"/>
+        <w:ind w:left="2160" w:hanging="360"/>
       </w:pPr>
     </w:lvl>
     <w:lvl w:ilvl="3">
@@ -6485,7 +6507,7 @@
       <w:lvlText w:val="%4."/>
       <w:lvlJc w:val="left"/>
       <w:pPr>
-        <w:ind w:left="2880" w:hanging="480"/>
+        <w:ind w:left="2880" w:hanging="360"/>
       </w:pPr>
     </w:lvl>
     <w:lvl w:ilvl="4">
@@ -6494,7 +6516,7 @@
       <w:lvlText w:val="%5."/>
       <w:lvlJc w:val="left"/>
       <w:pPr>
-        <w:ind w:left="3600" w:hanging="480"/>
+        <w:ind w:left="3600" w:hanging="360"/>
       </w:pPr>
     </w:lvl>
     <w:lvl w:ilvl="5">
@@ -6503,7 +6525,7 @@
       <w:lvlText w:val="%6."/>
       <w:lvlJc w:val="left"/>
       <w:pPr>
-        <w:ind w:left="4320" w:hanging="480"/>
+        <w:ind w:left="4320" w:hanging="360"/>
       </w:pPr>
     </w:lvl>
     <w:lvl w:ilvl="6">
@@ -6512,7 +6534,7 @@
       <w:lvlText w:val="%7."/>
       <w:lvlJc w:val="left"/>
       <w:pPr>
-        <w:ind w:left="5040" w:hanging="480"/>
+        <w:ind w:left="5040" w:hanging="360"/>
       </w:pPr>
     </w:lvl>
     <w:lvl w:ilvl="7">
@@ -6521,7 +6543,7 @@
       <w:lvlText w:val="%8."/>
       <w:lvlJc w:val="left"/>
       <w:pPr>
-        <w:ind w:left="5760" w:hanging="480"/>
+        <w:ind w:left="5760" w:hanging="360"/>
       </w:pPr>
     </w:lvl>
     <w:lvl w:ilvl="8">
@@ -6530,7 +6552,7 @@
       <w:lvlText w:val="%9."/>
       <w:lvlJc w:val="left"/>
       <w:pPr>
-        <w:ind w:left="6480" w:hanging="480"/>
+        <w:ind w:left="6480" w:hanging="360"/>
       </w:pPr>
     </w:lvl>
   </w:abstractNum>
@@ -6635,10 +6657,10 @@
     <w:name w:val="Body Text"/>
     <w:basedOn w:val="Normal"/>
     <w:link w:val="BodyTextChar"/>
+    <w:qFormat/>
     <w:pPr>
       <w:spacing w:after="180" w:before="180"/>
     </w:pPr>
-    <w:qFormat/>
   </w:style>
   <w:style w:customStyle="1" w:styleId="FirstParagraph" w:type="paragraph">
     <w:name w:val="First Paragraph"/>
@@ -6658,36 +6680,70 @@
     <w:name w:val="Title"/>
     <w:basedOn w:val="Normal"/>
     <w:next w:val="BodyText"/>
+    <w:link w:val="TitleChar"/>
+    <w:uiPriority w:val="10"/>
     <w:qFormat/>
+    <w:rsid w:val="00A10FD9"/>
     <w:pPr>
-      <w:keepNext/>
-      <w:keepLines/>
-      <w:spacing w:after="240" w:before="480"/>
+      <w:spacing w:after="80" w:line="240" w:lineRule="auto"/>
+      <w:contextualSpacing/>
       <w:jc w:val="center"/>
     </w:pPr>
     <w:rPr>
       <w:rFonts w:asciiTheme="majorHAnsi" w:cstheme="majorBidi" w:eastAsiaTheme="majorEastAsia" w:hAnsiTheme="majorHAnsi"/>
-      <w:b/>
-      <w:bCs/>
-      <w:color w:themeColor="accent1" w:themeShade="B5" w:val="345A8A"/>
-      <w:sz w:val="36"/>
-      <w:szCs w:val="36"/>
+      <w:spacing w:val="-10"/>
+      <w:kern w:val="28"/>
+      <w:sz w:val="56"/>
+      <w:szCs w:val="56"/>
+    </w:rPr>
+  </w:style>
+  <w:style w:customStyle="1" w:styleId="TitleChar" w:type="character">
+    <w:name w:val="Title Char"/>
+    <w:basedOn w:val="DefaultParagraphFont"/>
+    <w:link w:val="Title"/>
+    <w:uiPriority w:val="10"/>
+    <w:rsid w:val="00A10FD9"/>
+    <w:rPr>
+      <w:rFonts w:asciiTheme="majorHAnsi" w:cstheme="majorBidi" w:eastAsiaTheme="majorEastAsia" w:hAnsiTheme="majorHAnsi"/>
+      <w:spacing w:val="-10"/>
+      <w:kern w:val="28"/>
+      <w:sz w:val="56"/>
+      <w:szCs w:val="56"/>
     </w:rPr>
   </w:style>
   <w:style w:styleId="Subtitle" w:type="paragraph">
     <w:name w:val="Subtitle"/>
-    <w:basedOn w:val="Title"/>
+    <w:basedOn w:val="Normal"/>
     <w:next w:val="BodyText"/>
+    <w:link w:val="SubtitleChar"/>
+    <w:uiPriority w:val="11"/>
     <w:qFormat/>
+    <w:rsid w:val="00A10FD9"/>
     <w:pPr>
-      <w:keepNext/>
-      <w:keepLines/>
-      <w:spacing w:after="240" w:before="240"/>
-      <w:jc w:val="center"/>
+      <w:numPr>
+        <w:ilvl w:val="1"/>
+      </w:numPr>
     </w:pPr>
     <w:rPr>
-      <w:sz w:val="30"/>
-      <w:szCs w:val="30"/>
+      <w:rFonts w:cstheme="majorBidi" w:eastAsiaTheme="majorEastAsia"/>
+      <w:color w:themeColor="text1" w:themeTint="A6" w:val="595959"/>
+      <w:spacing w:val="15"/>
+      <w:sz w:val="28"/>
+      <w:szCs w:val="28"/>
+    </w:rPr>
+  </w:style>
+  <w:style w:customStyle="1" w:styleId="SubtitleChar" w:type="character">
+    <w:name w:val="Subtitle Char"/>
+    <w:basedOn w:val="DefaultParagraphFont"/>
+    <w:link w:val="Subtitle"/>
+    <w:uiPriority w:val="11"/>
+    <w:rsid w:val="00A10FD9"/>
+    <w:rPr>
+      <w:rFonts w:cstheme="majorBidi" w:eastAsiaTheme="majorEastAsia"/>
+      <w:color w:themeColor="text1" w:themeTint="A6" w:val="595959"/>
+      <w:spacing w:val="15"/>
+      <w:sz w:val="28"/>
+      <w:szCs w:val="28"/>
     </w:rPr>
   </w:style>
   <w:style w:customStyle="1" w:styleId="Author" w:type="paragraph">
@@ -6718,15 +6774,14 @@
     <w:pPr>
       <w:keepNext/>
       <w:keepLines/>
+      <w:spacing w:after="0" w:before="300"/>
       <w:jc w:val="center"/>
-      <w:spacing w:after="0" w:before="300"/>
     </w:pPr>
     <w:rPr>
+      <w:b/>
+      <w:color w:val="345A8A"/>
       <w:sz w:val="20"/>
       <w:szCs w:val="20"/>
-      <w:b/>
-      <w:color w:val="345A8A"/>
-      &gt;
     </w:rPr>
   </w:style>
   <w:style w:customStyle="1" w:styleId="Abstract" w:type="paragraph">
@@ -6753,191 +6808,321 @@
     <w:rPr/>
   </w:style>
   <w:style w:styleId="Heading1" w:type="paragraph">
-    <w:name w:val="Heading 1"/>
+    <w:name w:val="heading 1"/>
     <w:basedOn w:val="Normal"/>
     <w:next w:val="BodyText"/>
+    <w:link w:val="Heading1Char"/>
     <w:uiPriority w:val="9"/>
     <w:qFormat/>
+    <w:rsid w:val="00A10FD9"/>
     <w:pPr>
       <w:keepNext/>
       <w:keepLines/>
-      <w:spacing w:after="0" w:before="480"/>
+      <w:spacing w:after="80" w:before="360"/>
       <w:outlineLvl w:val="0"/>
     </w:pPr>
     <w:rPr>
       <w:rFonts w:asciiTheme="majorHAnsi" w:cstheme="majorBidi" w:eastAsiaTheme="majorEastAsia" w:hAnsiTheme="majorHAnsi"/>
-      <w:b/>
-      <w:bCs/>
-      <w:color w:themeColor="accent1" w:val="4F81BD"/>
-      <w:sz w:val="32"/>
-      <w:szCs w:val="32"/>
+      <w:color w:themeColor="accent1" w:themeShade="BF" w:val="0F4761"/>
+      <w:sz w:val="40"/>
+      <w:szCs w:val="40"/>
     </w:rPr>
   </w:style>
   <w:style w:styleId="Heading2" w:type="paragraph">
-    <w:name w:val="Heading 2"/>
+    <w:name w:val="heading 2"/>
     <w:basedOn w:val="Normal"/>
     <w:next w:val="BodyText"/>
+    <w:link w:val="Heading2Char"/>
     <w:uiPriority w:val="9"/>
+    <w:semiHidden/>
     <w:unhideWhenUsed/>
     <w:qFormat/>
+    <w:rsid w:val="00A10FD9"/>
     <w:pPr>
       <w:keepNext/>
       <w:keepLines/>
-      <w:spacing w:after="0" w:before="200"/>
+      <w:spacing w:after="80" w:before="160"/>
       <w:outlineLvl w:val="1"/>
     </w:pPr>
     <w:rPr>
       <w:rFonts w:asciiTheme="majorHAnsi" w:cstheme="majorBidi" w:eastAsiaTheme="majorEastAsia" w:hAnsiTheme="majorHAnsi"/>
-      <w:b/>
-      <w:bCs/>
-      <w:color w:themeColor="accent1" w:val="4F81BD"/>
+      <w:color w:themeColor="accent1" w:themeShade="BF" w:val="0F4761"/>
+      <w:sz w:val="32"/>
+      <w:szCs w:val="32"/>
+    </w:rPr>
+  </w:style>
+  <w:style w:styleId="Heading3" w:type="paragraph">
+    <w:name w:val="heading 3"/>
+    <w:basedOn w:val="Normal"/>
+    <w:next w:val="BodyText"/>
+    <w:link w:val="Heading3Char"/>
+    <w:uiPriority w:val="9"/>
+    <w:semiHidden/>
+    <w:unhideWhenUsed/>
+    <w:qFormat/>
+    <w:rsid w:val="00A10FD9"/>
+    <w:pPr>
+      <w:keepNext/>
+      <w:keepLines/>
+      <w:spacing w:after="80" w:before="160"/>
+      <w:outlineLvl w:val="2"/>
+    </w:pPr>
+    <w:rPr>
+      <w:rFonts w:cstheme="majorBidi" w:eastAsiaTheme="majorEastAsia"/>
+      <w:color w:themeColor="accent1" w:themeShade="BF" w:val="0F4761"/>
       <w:sz w:val="28"/>
       <w:szCs w:val="28"/>
     </w:rPr>
   </w:style>
-  <w:style w:styleId="Heading3" w:type="paragraph">
-    <w:name w:val="Heading 3"/>
+  <w:style w:styleId="Heading4" w:type="paragraph">
+    <w:name w:val="heading 4"/>
     <w:basedOn w:val="Normal"/>
     <w:next w:val="BodyText"/>
+    <w:link w:val="Heading4Char"/>
     <w:uiPriority w:val="9"/>
+    <w:semiHidden/>
     <w:unhideWhenUsed/>
     <w:qFormat/>
+    <w:rsid w:val="00A10FD9"/>
     <w:pPr>
       <w:keepNext/>
       <w:keepLines/>
-      <w:spacing w:after="0" w:before="200"/>
-      <w:outlineLvl w:val="2"/>
+      <w:spacing w:after="40" w:before="80"/>
+      <w:outlineLvl w:val="3"/>
     </w:pPr>
     <w:rPr>
-      <w:rFonts w:asciiTheme="majorHAnsi" w:cstheme="majorBidi" w:eastAsiaTheme="majorEastAsia" w:hAnsiTheme="majorHAnsi"/>
-      <w:b/>
-      <w:bCs/>
-      <w:color w:themeColor="accent1" w:val="4F81BD"/>
-      <w:sz w:val="24"/>
-      <w:szCs w:val="24"/>
+      <w:rFonts w:cstheme="majorBidi" w:eastAsiaTheme="majorEastAsia"/>
+      <w:i/>
+      <w:iCs/>
+      <w:color w:themeColor="accent1" w:themeShade="BF" w:val="0F4761"/>
     </w:rPr>
   </w:style>
-  <w:style w:styleId="Heading4" w:type="paragraph">
-    <w:name w:val="Heading 4"/>
+  <w:style w:styleId="Heading5" w:type="paragraph">
+    <w:name w:val="heading 5"/>
     <w:basedOn w:val="Normal"/>
     <w:next w:val="BodyText"/>
+    <w:link w:val="Heading5Char"/>
     <w:uiPriority w:val="9"/>
+    <w:semiHidden/>
     <w:unhideWhenUsed/>
     <w:qFormat/>
+    <w:rsid w:val="00A10FD9"/>
     <w:pPr>
       <w:keepNext/>
       <w:keepLines/>
-      <w:spacing w:after="0" w:before="200"/>
-      <w:outlineLvl w:val="3"/>
+      <w:spacing w:after="40" w:before="80"/>
+      <w:outlineLvl w:val="4"/>
     </w:pPr>
     <w:rPr>
-      <w:rFonts w:asciiTheme="majorHAnsi" w:cstheme="majorBidi" w:eastAsiaTheme="majorEastAsia" w:hAnsiTheme="majorHAnsi"/>
-      <w:i/>
-      <w:bCs/>
-      <w:color w:themeColor="accent1" w:val="4F81BD"/>
-      <w:sz w:val="24"/>
-      <w:szCs w:val="24"/>
+      <w:rFonts w:cstheme="majorBidi" w:eastAsiaTheme="majorEastAsia"/>
+      <w:color w:themeColor="accent1" w:themeShade="BF" w:val="0F4761"/>
     </w:rPr>
   </w:style>
-  <w:style w:styleId="Heading5" w:type="paragraph">
-    <w:name w:val="Heading 5"/>
+  <w:style w:styleId="Heading6" w:type="paragraph">
+    <w:name w:val="heading 6"/>
     <w:basedOn w:val="Normal"/>
     <w:next w:val="BodyText"/>
+    <w:link w:val="Heading6Char"/>
     <w:uiPriority w:val="9"/>
+    <w:semiHidden/>
     <w:unhideWhenUsed/>
     <w:qFormat/>
+    <w:rsid w:val="00A10FD9"/>
     <w:pPr>
       <w:keepNext/>
       <w:keepLines/>
-      <w:spacing w:after="0" w:before="200"/>
-      <w:outlineLvl w:val="4"/>
+      <w:spacing w:after="0" w:before="40"/>
+      <w:outlineLvl w:val="5"/>
     </w:pPr>
     <w:rPr>
-      <w:rFonts w:asciiTheme="majorHAnsi" w:cstheme="majorBidi" w:eastAsiaTheme="majorEastAsia" w:hAnsiTheme="majorHAnsi"/>
+      <w:rFonts w:cstheme="majorBidi" w:eastAsiaTheme="majorEastAsia"/>
+      <w:i/>
       <w:iCs/>
-      <w:color w:themeColor="accent1" w:val="4F81BD"/>
-      <w:sz w:val="24"/>
-      <w:szCs w:val="24"/>
+      <w:color w:themeColor="text1" w:themeTint="A6" w:val="595959"/>
     </w:rPr>
   </w:style>
-  <w:style w:styleId="Heading6" w:type="paragraph">
-    <w:name w:val="Heading 6"/>
+  <w:style w:styleId="Heading7" w:type="paragraph">
+    <w:name w:val="heading 7"/>
     <w:basedOn w:val="Normal"/>
     <w:next w:val="BodyText"/>
+    <w:link w:val="Heading7Char"/>
     <w:uiPriority w:val="9"/>
+    <w:semiHidden/>
     <w:unhideWhenUsed/>
     <w:qFormat/>
+    <w:rsid w:val="00A10FD9"/>
     <w:pPr>
       <w:keepNext/>
       <w:keepLines/>
-      <w:spacing w:after="0" w:before="200"/>
-      <w:outlineLvl w:val="5"/>
+      <w:spacing w:after="0" w:before="40"/>
+      <w:outlineLvl w:val="6"/>
     </w:pPr>
     <w:rPr>
-      <w:rFonts w:asciiTheme="majorHAnsi" w:cstheme="majorBidi" w:eastAsiaTheme="majorEastAsia" w:hAnsiTheme="majorHAnsi"/>
-      <w:color w:themeColor="accent1" w:val="4F81BD"/>
-      <w:sz w:val="24"/>
-      <w:szCs w:val="24"/>
+      <w:rFonts w:cstheme="majorBidi" w:eastAsiaTheme="majorEastAsia"/>
+      <w:color w:themeColor="text1" w:themeTint="A6" w:val="595959"/>
     </w:rPr>
   </w:style>
-  <w:style w:styleId="Heading7" w:type="paragraph">
-    <w:name w:val="Heading 7"/>
+  <w:style w:styleId="Heading8" w:type="paragraph">
+    <w:name w:val="heading 8"/>
     <w:basedOn w:val="Normal"/>
     <w:next w:val="BodyText"/>
+    <w:link w:val="Heading8Char"/>
     <w:uiPriority w:val="9"/>
+    <w:semiHidden/>
     <w:unhideWhenUsed/>
     <w:qFormat/>
+    <w:rsid w:val="00A10FD9"/>
     <w:pPr>
       <w:keepNext/>
       <w:keepLines/>
-      <w:spacing w:after="0" w:before="200"/>
-      <w:outlineLvl w:val="6"/>
+      <w:spacing w:after="0"/>
+      <w:outlineLvl w:val="7"/>
     </w:pPr>
     <w:rPr>
-      <w:rFonts w:asciiTheme="majorHAnsi" w:cstheme="majorBidi" w:eastAsiaTheme="majorEastAsia" w:hAnsiTheme="majorHAnsi"/>
-      <w:color w:themeColor="accent1" w:val="4F81BD"/>
-      <w:sz w:val="24"/>
-      <w:szCs w:val="24"/>
+      <w:rFonts w:cstheme="majorBidi" w:eastAsiaTheme="majorEastAsia"/>
+      <w:i/>
+      <w:iCs/>
+      <w:color w:themeColor="text1" w:themeTint="D8" w:val="272727"/>
     </w:rPr>
   </w:style>
-  <w:style w:styleId="Heading8" w:type="paragraph">
-    <w:name w:val="Heading 8"/>
+  <w:style w:styleId="Heading9" w:type="paragraph">
+    <w:name w:val="heading 9"/>
     <w:basedOn w:val="Normal"/>
     <w:next w:val="BodyText"/>
+    <w:link w:val="Heading9Char"/>
     <w:uiPriority w:val="9"/>
+    <w:semiHidden/>
     <w:unhideWhenUsed/>
     <w:qFormat/>
+    <w:rsid w:val="00A10FD9"/>
     <w:pPr>
       <w:keepNext/>
       <w:keepLines/>
-      <w:spacing w:after="0" w:before="200"/>
-      <w:outlineLvl w:val="7"/>
-    </w:pPr>
-    <w:rPr>
-      <w:rFonts w:asciiTheme="majorHAnsi" w:cstheme="majorBidi" w:eastAsiaTheme="majorEastAsia" w:hAnsiTheme="majorHAnsi"/>
-      <w:color w:themeColor="accent1" w:val="4F81BD"/>
-      <w:sz w:val="24"/>
-      <w:szCs w:val="24"/>
-    </w:rPr>
-  </w:style>
-  <w:style w:styleId="Heading9" w:type="paragraph">
-    <w:name w:val="Heading 9"/>
-    <w:basedOn w:val="Normal"/>
-    <w:next w:val="BodyText"/>
-    <w:uiPriority w:val="9"/>
-    <w:unhideWhenUsed/>
-    <w:qFormat/>
-    <w:pPr>
-      <w:keepNext/>
-      <w:keepLines/>
-      <w:spacing w:after="0" w:before="200"/>
+      <w:spacing w:after="0"/>
       <w:outlineLvl w:val="8"/>
     </w:pPr>
     <w:rPr>
+      <w:rFonts w:cstheme="majorBidi" w:eastAsiaTheme="majorEastAsia"/>
+      <w:color w:themeColor="text1" w:themeTint="D8" w:val="272727"/>
+    </w:rPr>
+  </w:style>
+  <w:style w:customStyle="1" w:styleId="Heading1Char" w:type="character">
+    <w:name w:val="Heading 1 Char"/>
+    <w:basedOn w:val="DefaultParagraphFont"/>
+    <w:link w:val="Heading1"/>
+    <w:uiPriority w:val="9"/>
+    <w:rsid w:val="00A10FD9"/>
+    <w:rPr>
       <w:rFonts w:asciiTheme="majorHAnsi" w:cstheme="majorBidi" w:eastAsiaTheme="majorEastAsia" w:hAnsiTheme="majorHAnsi"/>
-      <w:color w:themeColor="accent1" w:val="4F81BD"/>
-      <w:sz w:val="24"/>
-      <w:szCs w:val="24"/>
+      <w:color w:themeColor="accent1" w:themeShade="BF" w:val="0F4761"/>
+      <w:sz w:val="40"/>
+      <w:szCs w:val="40"/>
+    </w:rPr>
+  </w:style>
+  <w:style w:customStyle="1" w:styleId="Heading2Char" w:type="character">
+    <w:name w:val="Heading 2 Char"/>
+    <w:basedOn w:val="DefaultParagraphFont"/>
+    <w:link w:val="Heading2"/>
+    <w:uiPriority w:val="9"/>
+    <w:semiHidden/>
+    <w:rsid w:val="00A10FD9"/>
+    <w:rPr>
+      <w:rFonts w:asciiTheme="majorHAnsi" w:cstheme="majorBidi" w:eastAsiaTheme="majorEastAsia" w:hAnsiTheme="majorHAnsi"/>
+      <w:color w:themeColor="accent1" w:themeShade="BF" w:val="0F4761"/>
+      <w:sz w:val="32"/>
+      <w:szCs w:val="32"/>
+    </w:rPr>
+  </w:style>
+  <w:style w:customStyle="1" w:styleId="Heading3Char" w:type="character">
+    <w:name w:val="Heading 3 Char"/>
+    <w:basedOn w:val="DefaultParagraphFont"/>
+    <w:link w:val="Heading3"/>
+    <w:uiPriority w:val="9"/>
+    <w:semiHidden/>
+    <w:rsid w:val="00A10FD9"/>
+    <w:rPr>
+      <w:rFonts w:cstheme="majorBidi" w:eastAsiaTheme="majorEastAsia"/>
+      <w:color w:themeColor="accent1" w:themeShade="BF" w:val="0F4761"/>
+      <w:sz w:val="28"/>
+      <w:szCs w:val="28"/>
+    </w:rPr>
+  </w:style>
+  <w:style w:customStyle="1" w:styleId="Heading4Char" w:type="character">
+    <w:name w:val="Heading 4 Char"/>
+    <w:basedOn w:val="DefaultParagraphFont"/>
+    <w:link w:val="Heading4"/>
+    <w:uiPriority w:val="9"/>
+    <w:semiHidden/>
+    <w:rsid w:val="00A10FD9"/>
+    <w:rPr>
+      <w:rFonts w:cstheme="majorBidi" w:eastAsiaTheme="majorEastAsia"/>
+      <w:i/>
+      <w:iCs/>
+      <w:color w:themeColor="accent1" w:themeShade="BF" w:val="0F4761"/>
+    </w:rPr>
+  </w:style>
+  <w:style w:customStyle="1" w:styleId="Heading5Char" w:type="character">
+    <w:name w:val="Heading 5 Char"/>
+    <w:basedOn w:val="DefaultParagraphFont"/>
+    <w:link w:val="Heading5"/>
+    <w:uiPriority w:val="9"/>
+    <w:semiHidden/>
+    <w:rsid w:val="00A10FD9"/>
+    <w:rPr>
+      <w:rFonts w:cstheme="majorBidi" w:eastAsiaTheme="majorEastAsia"/>
+      <w:color w:themeColor="accent1" w:themeShade="BF" w:val="0F4761"/>
+    </w:rPr>
+  </w:style>
+  <w:style w:customStyle="1" w:styleId="Heading6Char" w:type="character">
+    <w:name w:val="Heading 6 Char"/>
+    <w:basedOn w:val="DefaultParagraphFont"/>
+    <w:link w:val="Heading6"/>
+    <w:uiPriority w:val="9"/>
+    <w:semiHidden/>
+    <w:rsid w:val="00A10FD9"/>
+    <w:rPr>
+      <w:rFonts w:cstheme="majorBidi" w:eastAsiaTheme="majorEastAsia"/>
+      <w:i/>
+      <w:iCs/>
+      <w:color w:themeColor="text1" w:themeTint="A6" w:val="595959"/>
+    </w:rPr>
+  </w:style>
+  <w:style w:customStyle="1" w:styleId="Heading7Char" w:type="character">
+    <w:name w:val="Heading 7 Char"/>
+    <w:basedOn w:val="DefaultParagraphFont"/>
+    <w:link w:val="Heading7"/>
+    <w:uiPriority w:val="9"/>
+    <w:semiHidden/>
+    <w:rsid w:val="00A10FD9"/>
+    <w:rPr>
+      <w:rFonts w:cstheme="majorBidi" w:eastAsiaTheme="majorEastAsia"/>
+      <w:color w:themeColor="text1" w:themeTint="A6" w:val="595959"/>
+    </w:rPr>
+  </w:style>
+  <w:style w:customStyle="1" w:styleId="Heading8Char" w:type="character">
+    <w:name w:val="Heading 8 Char"/>
+    <w:basedOn w:val="DefaultParagraphFont"/>
+    <w:link w:val="Heading8"/>
+    <w:uiPriority w:val="9"/>
+    <w:semiHidden/>
+    <w:rsid w:val="00A10FD9"/>
+    <w:rPr>
+      <w:rFonts w:cstheme="majorBidi" w:eastAsiaTheme="majorEastAsia"/>
+      <w:i/>
+      <w:iCs/>
+      <w:color w:themeColor="text1" w:themeTint="D8" w:val="272727"/>
+    </w:rPr>
+  </w:style>
+  <w:style w:customStyle="1" w:styleId="Heading9Char" w:type="character">
+    <w:name w:val="Heading 9 Char"/>
+    <w:basedOn w:val="DefaultParagraphFont"/>
+    <w:link w:val="Heading9"/>
+    <w:uiPriority w:val="9"/>
+    <w:semiHidden/>
+    <w:rsid w:val="00A10FD9"/>
+    <w:rPr>
+      <w:rFonts w:cstheme="majorBidi" w:eastAsiaTheme="majorEastAsia"/>
+      <w:color w:themeColor="text1" w:themeTint="D8" w:val="272727"/>
     </w:rPr>
   </w:style>
   <w:style w:styleId="BlockText" w:type="paragraph">
@@ -6962,8 +7147,8 @@
   </w:style>
   <w:style w:styleId="FootnoteBlockText" w:type="paragraph">
     <w:name w:val="Footnote Block Text"/>
-    <w:basedOn w:val="Footnote Text"/>
-    <w:next w:val="Footnote Text"/>
+    <w:basedOn w:val="FootnoteText"/>
+    <w:next w:val="FootnoteText"/>
     <w:uiPriority w:val="9"/>
     <w:unhideWhenUsed/>
     <w:qFormat/>
@@ -7001,10 +7186,10 @@
         <w:jc w:val="left"/>
       </w:trPr>
       <w:tcPr>
-        <w:vAlign w:val="bottom"/>
         <w:tcBorders>
           <w:bottom w:val="single"/>
         </w:tcBorders>
+        <w:vAlign w:val="bottom"/>
       </w:tcPr>
     </w:tblStylePr>
   </w:style>
@@ -7120,6 +7305,7 @@
     <w:name w:val="KeywordTok"/>
     <w:basedOn w:val="VerbatimChar"/>
     <w:rPr>
+      <w:b/>
       <w:color w:val="003b4f"/>
       <w:shd w:val="clear" w:fill="f1f3f5"/>
     </w:rPr>
@@ -7224,9 +7410,9 @@
     <w:name w:val="DocumentationTok"/>
     <w:basedOn w:val="VerbatimChar"/>
     <w:rPr>
+      <w:i/>
       <w:color w:val="5e5e5e"/>
       <w:shd w:val="clear" w:fill="f1f3f5"/>
-      <w:i/>
     </w:rPr>
   </w:style>
   <w:style w:type="character" w:customStyle="1" w:styleId="AnnotationTok">
@@ -7241,9 +7427,9 @@
     <w:name w:val="CommentVarTok"/>
     <w:basedOn w:val="VerbatimChar"/>
     <w:rPr>
+      <w:i/>
       <w:color w:val="5e5e5e"/>
       <w:shd w:val="clear" w:fill="f1f3f5"/>
-      <w:i/>
     </w:rPr>
   </w:style>
   <w:style w:type="character" w:customStyle="1" w:styleId="OtherTok">
@@ -7274,6 +7460,7 @@
     <w:name w:val="ControlFlowTok"/>
     <w:basedOn w:val="VerbatimChar"/>
     <w:rPr>
+      <w:b/>
       <w:color w:val="003b4f"/>
       <w:shd w:val="clear" w:fill="f1f3f5"/>
     </w:rPr>
@@ -7338,9 +7525,9 @@
     <w:name w:val="WarningTok"/>
     <w:basedOn w:val="VerbatimChar"/>
     <w:rPr>
+      <w:i/>
       <w:color w:val="5e5e5e"/>
       <w:shd w:val="clear" w:fill="f1f3f5"/>
-      <w:i/>
     </w:rPr>
   </w:style>
   <w:style w:type="character" w:customStyle="1" w:styleId="AlertTok">
@@ -7381,44 +7568,44 @@
         <a:sysClr val="window" lastClr="FFFFFF"/>
       </a:lt1>
       <a:dk2>
-        <a:srgbClr val="1F497D"/>
+        <a:srgbClr val="0E2841"/>
       </a:dk2>
       <a:lt2>
-        <a:srgbClr val="EEECE1"/>
+        <a:srgbClr val="E8E8E8"/>
       </a:lt2>
       <a:accent1>
-        <a:srgbClr val="4F81BD"/>
+        <a:srgbClr val="156082"/>
       </a:accent1>
       <a:accent2>
-        <a:srgbClr val="C0504D"/>
+        <a:srgbClr val="E97132"/>
       </a:accent2>
       <a:accent3>
-        <a:srgbClr val="9BBB59"/>
+        <a:srgbClr val="196B24"/>
       </a:accent3>
       <a:accent4>
-        <a:srgbClr val="8064A2"/>
+        <a:srgbClr val="0F9ED5"/>
       </a:accent4>
       <a:accent5>
-        <a:srgbClr val="4BACC6"/>
+        <a:srgbClr val="A02B93"/>
       </a:accent5>
       <a:accent6>
-        <a:srgbClr val="F79646"/>
+        <a:srgbClr val="4EA72E"/>
       </a:accent6>
       <a:hlink>
-        <a:srgbClr val="0000FF"/>
+        <a:srgbClr val="467886"/>
       </a:hlink>
       <a:folHlink>
-        <a:srgbClr val="800080"/>
+        <a:srgbClr val="96607D"/>
       </a:folHlink>
     </a:clrScheme>
     <a:fontScheme name="Office">
       <a:majorFont>
-        <a:latin typeface="Calibri"/>
+        <a:latin typeface="Aptos Display" panose="02110004020202020204"/>
         <a:ea typeface=""/>
         <a:cs typeface=""/>
-        <a:font script="Jpan" typeface="ＭＳ ゴシック"/>
+        <a:font script="Jpan" typeface="游ゴシック Light"/>
         <a:font script="Hang" typeface="맑은 고딕"/>
-        <a:font script="Hans" typeface="宋体"/>
+        <a:font script="Hans" typeface="等线 Light"/>
         <a:font script="Hant" typeface="新細明體"/>
         <a:font script="Arab" typeface="Times New Roman"/>
         <a:font script="Hebr" typeface="Times New Roman"/>
@@ -7445,14 +7632,32 @@
         <a:font script="Mong" typeface="Mongolian Baiti"/>
         <a:font script="Viet" typeface="Times New Roman"/>
         <a:font script="Uigh" typeface="Microsoft Uighur"/>
+        <a:font script="Geor" typeface="Sylfaen"/>
+        <a:font script="Armn" typeface="Arial"/>
+        <a:font script="Bugi" typeface="Leelawadee UI"/>
+        <a:font script="Bopo" typeface="Microsoft JhengHei"/>
+        <a:font script="Java" typeface="Javanese Text"/>
+        <a:font script="Lisu" typeface="Segoe UI"/>
+        <a:font script="Mymr" typeface="Myanmar Text"/>
+        <a:font script="Nkoo" typeface="Ebrima"/>
+        <a:font script="Olck" typeface="Nirmala UI"/>
+        <a:font script="Osma" typeface="Ebrima"/>
+        <a:font script="Phag" typeface="Phagspa"/>
+        <a:font script="Syrn" typeface="Estrangelo Edessa"/>
+        <a:font script="Syrj" typeface="Estrangelo Edessa"/>
+        <a:font script="Syre" typeface="Estrangelo Edessa"/>
+        <a:font script="Sora" typeface="Nirmala UI"/>
+        <a:font script="Tale" typeface="Microsoft Tai Le"/>
+        <a:font script="Talu" typeface="Microsoft New Tai Lue"/>
+        <a:font script="Tfng" typeface="Ebrima"/>
       </a:majorFont>
       <a:minorFont>
-        <a:latin typeface="Cambria"/>
+        <a:latin typeface="Aptos" panose="02110004020202020204"/>
         <a:ea typeface=""/>
         <a:cs typeface=""/>
-        <a:font script="Jpan" typeface="ＭＳ 明朝"/>
+        <a:font script="Jpan" typeface="游明朝"/>
         <a:font script="Hang" typeface="맑은 고딕"/>
-        <a:font script="Hans" typeface="宋体"/>
+        <a:font script="Hans" typeface="等线"/>
         <a:font script="Hant" typeface="新細明體"/>
         <a:font script="Arab" typeface="Arial"/>
         <a:font script="Hebr" typeface="Arial"/>
@@ -7479,6 +7684,24 @@
         <a:font script="Mong" typeface="Mongolian Baiti"/>
         <a:font script="Viet" typeface="Arial"/>
         <a:font script="Uigh" typeface="Microsoft Uighur"/>
+        <a:font script="Geor" typeface="Sylfaen"/>
+        <a:font script="Armn" typeface="Arial"/>
+        <a:font script="Bugi" typeface="Leelawadee UI"/>
+        <a:font script="Bopo" typeface="Microsoft JhengHei"/>
+        <a:font script="Java" typeface="Javanese Text"/>
+        <a:font script="Lisu" typeface="Segoe UI"/>
+        <a:font script="Mymr" typeface="Myanmar Text"/>
+        <a:font script="Nkoo" typeface="Ebrima"/>
+        <a:font script="Olck" typeface="Nirmala UI"/>
+        <a:font script="Osma" typeface="Ebrima"/>
+        <a:font script="Phag" typeface="Phagspa"/>
+        <a:font script="Syrn" typeface="Estrangelo Edessa"/>
+        <a:font script="Syrj" typeface="Estrangelo Edessa"/>
+        <a:font script="Syre" typeface="Estrangelo Edessa"/>
+        <a:font script="Sora" typeface="Nirmala UI"/>
+        <a:font script="Tale" typeface="Microsoft Tai Le"/>
+        <a:font script="Talu" typeface="Microsoft New Tai Lue"/>
+        <a:font script="Tfng" typeface="Ebrima"/>
       </a:minorFont>
     </a:fontScheme>
     <a:fmtScheme name="Office">
@@ -7490,200 +7713,141 @@
           <a:gsLst>
             <a:gs pos="0">
               <a:schemeClr val="phClr">
-                <a:tint val="50000"/>
-                <a:satMod val="300000"/>
+                <a:lumMod val="110000"/>
+                <a:satMod val="105000"/>
+                <a:tint val="67000"/>
               </a:schemeClr>
             </a:gs>
-            <a:gs pos="35000">
+            <a:gs pos="50000">
               <a:schemeClr val="phClr">
-                <a:tint val="37000"/>
-                <a:satMod val="300000"/>
+                <a:lumMod val="105000"/>
+                <a:satMod val="103000"/>
+                <a:tint val="73000"/>
               </a:schemeClr>
             </a:gs>
             <a:gs pos="100000">
               <a:schemeClr val="phClr">
-                <a:tint val="15000"/>
-                <a:satMod val="350000"/>
+                <a:lumMod val="105000"/>
+                <a:satMod val="109000"/>
+                <a:tint val="81000"/>
               </a:schemeClr>
             </a:gs>
           </a:gsLst>
-          <a:lin ang="16200000" scaled="1"/>
+          <a:lin ang="5400000" scaled="0"/>
         </a:gradFill>
         <a:gradFill rotWithShape="1">
           <a:gsLst>
             <a:gs pos="0">
               <a:schemeClr val="phClr">
-                <a:tint val="100000"/>
+                <a:satMod val="103000"/>
+                <a:lumMod val="102000"/>
+                <a:tint val="94000"/>
+              </a:schemeClr>
+            </a:gs>
+            <a:gs pos="50000">
+              <a:schemeClr val="phClr">
+                <a:satMod val="110000"/>
+                <a:lumMod val="100000"/>
                 <a:shade val="100000"/>
-                <a:satMod val="130000"/>
               </a:schemeClr>
             </a:gs>
             <a:gs pos="100000">
               <a:schemeClr val="phClr">
-                <a:tint val="50000"/>
-                <a:shade val="100000"/>
-                <a:satMod val="350000"/>
+                <a:lumMod val="99000"/>
+                <a:satMod val="120000"/>
+                <a:shade val="78000"/>
               </a:schemeClr>
             </a:gs>
           </a:gsLst>
-          <a:lin ang="16200000" scaled="0"/>
+          <a:lin ang="5400000" scaled="0"/>
         </a:gradFill>
       </a:fillStyleLst>
       <a:lnStyleLst>
-        <a:ln w="9525" cap="flat" cmpd="sng" algn="ctr">
-          <a:solidFill>
-            <a:schemeClr val="phClr">
-              <a:shade val="95000"/>
-              <a:satMod val="105000"/>
-            </a:schemeClr>
-          </a:solidFill>
-          <a:prstDash val="solid"/>
-        </a:ln>
-        <a:ln w="25400" cap="flat" cmpd="sng" algn="ctr">
+        <a:ln w="6350" cap="flat" cmpd="sng" algn="ctr">
           <a:solidFill>
             <a:schemeClr val="phClr"/>
           </a:solidFill>
           <a:prstDash val="solid"/>
+          <a:miter lim="800000"/>
         </a:ln>
-        <a:ln w="38100" cap="flat" cmpd="sng" algn="ctr">
+        <a:ln w="12700" cap="flat" cmpd="sng" algn="ctr">
           <a:solidFill>
             <a:schemeClr val="phClr"/>
           </a:solidFill>
           <a:prstDash val="solid"/>
+          <a:miter lim="800000"/>
+        </a:ln>
+        <a:ln w="19050" cap="flat" cmpd="sng" algn="ctr">
+          <a:solidFill>
+            <a:schemeClr val="phClr"/>
+          </a:solidFill>
+          <a:prstDash val="solid"/>
+          <a:miter lim="800000"/>
         </a:ln>
       </a:lnStyleLst>
       <a:effectStyleLst>
         <a:effectStyle>
+          <a:effectLst/>
+        </a:effectStyle>
+        <a:effectStyle>
+          <a:effectLst/>
+        </a:effectStyle>
+        <a:effectStyle>
           <a:effectLst>
-            <a:outerShdw blurRad="40000" dist="20000" dir="5400000" rotWithShape="0">
+            <a:outerShdw blurRad="57150" dist="19050" dir="5400000" algn="ctr" rotWithShape="0">
               <a:srgbClr val="000000">
-                <a:alpha val="38000"/>
+                <a:alpha val="63000"/>
               </a:srgbClr>
             </a:outerShdw>
           </a:effectLst>
-        </a:effectStyle>
-        <a:effectStyle>
-          <a:effectLst>
-            <a:outerShdw blurRad="40000" dist="23000" dir="5400000" rotWithShape="0">
-              <a:srgbClr val="000000">
-                <a:alpha val="35000"/>
-              </a:srgbClr>
-            </a:outerShdw>
-          </a:effectLst>
-        </a:effectStyle>
-        <a:effectStyle>
-          <a:effectLst>
-            <a:outerShdw blurRad="40000" dist="23000" dir="5400000" rotWithShape="0">
-              <a:srgbClr val="000000">
-                <a:alpha val="35000"/>
-              </a:srgbClr>
-            </a:outerShdw>
-          </a:effectLst>
-          <a:scene3d>
-            <a:camera prst="orthographicFront">
-              <a:rot lat="0" lon="0" rev="0"/>
-            </a:camera>
-            <a:lightRig rig="threePt" dir="t">
-              <a:rot lat="0" lon="0" rev="1200000"/>
-            </a:lightRig>
-          </a:scene3d>
-          <a:sp3d>
-            <a:bevelT w="63500" h="25400"/>
-          </a:sp3d>
         </a:effectStyle>
       </a:effectStyleLst>
       <a:bgFillStyleLst>
         <a:solidFill>
           <a:schemeClr val="phClr"/>
         </a:solidFill>
+        <a:solidFill>
+          <a:schemeClr val="phClr">
+            <a:tint val="95000"/>
+            <a:satMod val="170000"/>
+          </a:schemeClr>
+        </a:solidFill>
         <a:gradFill rotWithShape="1">
           <a:gsLst>
             <a:gs pos="0">
               <a:schemeClr val="phClr">
-                <a:tint val="40000"/>
-                <a:satMod val="350000"/>
+                <a:tint val="93000"/>
+                <a:satMod val="150000"/>
+                <a:shade val="98000"/>
+                <a:lumMod val="102000"/>
               </a:schemeClr>
             </a:gs>
-            <a:gs pos="40000">
+            <a:gs pos="50000">
               <a:schemeClr val="phClr">
-                <a:tint val="45000"/>
-                <a:shade val="99000"/>
-                <a:satMod val="350000"/>
+                <a:tint val="98000"/>
+                <a:satMod val="130000"/>
+                <a:shade val="90000"/>
+                <a:lumMod val="103000"/>
               </a:schemeClr>
             </a:gs>
             <a:gs pos="100000">
               <a:schemeClr val="phClr">
-                <a:shade val="20000"/>
-                <a:satMod val="255000"/>
+                <a:shade val="63000"/>
+                <a:satMod val="120000"/>
               </a:schemeClr>
             </a:gs>
           </a:gsLst>
-          <a:path path="circle">
-            <a:fillToRect l="50000" t="-80000" r="50000" b="180000"/>
-          </a:path>
-        </a:gradFill>
-        <a:gradFill rotWithShape="1">
-          <a:gsLst>
-            <a:gs pos="0">
-              <a:schemeClr val="phClr">
-                <a:tint val="80000"/>
-                <a:satMod val="300000"/>
-              </a:schemeClr>
-            </a:gs>
-            <a:gs pos="100000">
-              <a:schemeClr val="phClr">
-                <a:shade val="30000"/>
-                <a:satMod val="200000"/>
-              </a:schemeClr>
-            </a:gs>
-          </a:gsLst>
-          <a:path path="circle">
-            <a:fillToRect l="50000" t="50000" r="50000" b="50000"/>
-          </a:path>
+          <a:lin ang="5400000" scaled="0"/>
         </a:gradFill>
       </a:bgFillStyleLst>
     </a:fmtScheme>
   </a:themeElements>
-  <a:objectDefaults>
-    <a:spDef>
-      <a:spPr/>
-      <a:bodyPr/>
-      <a:lstStyle/>
-      <a:style>
-        <a:lnRef idx="1">
-          <a:schemeClr val="accent1"/>
-        </a:lnRef>
-        <a:fillRef idx="3">
-          <a:schemeClr val="accent1"/>
-        </a:fillRef>
-        <a:effectRef idx="2">
-          <a:schemeClr val="accent1"/>
-        </a:effectRef>
-        <a:fontRef idx="minor">
-          <a:schemeClr val="lt1"/>
-        </a:fontRef>
-      </a:style>
-    </a:spDef>
-    <a:lnDef>
-      <a:spPr/>
-      <a:bodyPr/>
-      <a:lstStyle/>
-      <a:style>
-        <a:lnRef idx="2">
-          <a:schemeClr val="accent1"/>
-        </a:lnRef>
-        <a:fillRef idx="0">
-          <a:schemeClr val="accent1"/>
-        </a:fillRef>
-        <a:effectRef idx="1">
-          <a:schemeClr val="accent1"/>
-        </a:effectRef>
-        <a:fontRef idx="minor">
-          <a:schemeClr val="tx1"/>
-        </a:fontRef>
-      </a:style>
-    </a:lnDef>
-  </a:objectDefaults>
+  <a:objectDefaults/>
   <a:extraClrSchemeLst/>
+  <a:extLst>
+    <a:ext uri="{05A4C25C-085E-4340-85A3-A5531E510DB2}">
+      <thm15:themeFamily xmlns:thm15="http://schemas.microsoft.com/office/thememl/2012/main" name="Office Theme" id="{2E142A2C-CD16-42D6-873A-C26D2A0506FA}" vid="{1BDDFF52-6CD6-40A5-AB3C-68EB2F1E4D0A}"/>
+    </a:ext>
+  </a:extLst>
 </a:theme>
 </file>
</xml_diff>